<commit_message>
Actualiza documentos de Fase 1
</commit_message>
<xml_diff>
--- a/Fase 1/Evidencias grupales/Ramirez_Karla_1.5_GuiaEstudiante_Fase 1_Definicion Proyecto APT (Español).docx
+++ b/Fase 1/Evidencias grupales/Ramirez_Karla_1.5_GuiaEstudiante_Fase 1_Definicion Proyecto APT (Español).docx
@@ -1,6 +1,6 @@
 
 <file path=word/document.xml><?xml version="1.0" encoding="utf-8"?>
-<w:document xmlns:wpc="http://schemas.microsoft.com/office/word/2010/wordprocessingCanvas" xmlns:cx="http://schemas.microsoft.com/office/drawing/2014/chartex" xmlns:mc="http://schemas.openxmlformats.org/markup-compatibility/2006" xmlns:o="urn:schemas-microsoft-com:office:office" xmlns:r="http://schemas.openxmlformats.org/officeDocument/2006/relationships" xmlns:m="http://schemas.openxmlformats.org/officeDocument/2006/math" xmlns:v="urn:schemas-microsoft-com:vml" xmlns:wp14="http://schemas.microsoft.com/office/word/2010/wordprocessingDrawing" xmlns:wp="http://schemas.openxmlformats.org/drawingml/2006/wordprocessingDrawing" xmlns:w10="urn:schemas-microsoft-com:office:word" xmlns:w="http://schemas.openxmlformats.org/wordprocessingml/2006/main" xmlns:w14="http://schemas.microsoft.com/office/word/2010/wordml" xmlns:w15="http://schemas.microsoft.com/office/word/2012/wordml" xmlns:w16se="http://schemas.microsoft.com/office/word/2015/wordml/symex" xmlns:wpg="http://schemas.microsoft.com/office/word/2010/wordprocessingGroup" xmlns:wpi="http://schemas.microsoft.com/office/word/2010/wordprocessingInk" xmlns:wne="http://schemas.microsoft.com/office/word/2006/wordml" xmlns:wps="http://schemas.microsoft.com/office/word/2010/wordprocessingShape" mc:Ignorable="w14 w15 w16se wp14">
+<w:document xmlns:wpc="http://schemas.microsoft.com/office/word/2010/wordprocessingCanvas" xmlns:cx="http://schemas.microsoft.com/office/drawing/2014/chartex" xmlns:cx1="http://schemas.microsoft.com/office/drawing/2015/9/8/chartex" xmlns:cx2="http://schemas.microsoft.com/office/drawing/2015/10/21/chartex" xmlns:cx3="http://schemas.microsoft.com/office/drawing/2016/5/9/chartex" xmlns:cx4="http://schemas.microsoft.com/office/drawing/2016/5/10/chartex" xmlns:cx5="http://schemas.microsoft.com/office/drawing/2016/5/11/chartex" xmlns:cx6="http://schemas.microsoft.com/office/drawing/2016/5/12/chartex" xmlns:cx7="http://schemas.microsoft.com/office/drawing/2016/5/13/chartex" xmlns:cx8="http://schemas.microsoft.com/office/drawing/2016/5/14/chartex" xmlns:mc="http://schemas.openxmlformats.org/markup-compatibility/2006" xmlns:aink="http://schemas.microsoft.com/office/drawing/2016/ink" xmlns:am3d="http://schemas.microsoft.com/office/drawing/2017/model3d" xmlns:o="urn:schemas-microsoft-com:office:office" xmlns:oel="http://schemas.microsoft.com/office/2019/extlst" xmlns:r="http://schemas.openxmlformats.org/officeDocument/2006/relationships" xmlns:m="http://schemas.openxmlformats.org/officeDocument/2006/math" xmlns:v="urn:schemas-microsoft-com:vml" xmlns:wp14="http://schemas.microsoft.com/office/word/2010/wordprocessingDrawing" xmlns:wp="http://schemas.openxmlformats.org/drawingml/2006/wordprocessingDrawing" xmlns:w10="urn:schemas-microsoft-com:office:word" xmlns:w="http://schemas.openxmlformats.org/wordprocessingml/2006/main" xmlns:w14="http://schemas.microsoft.com/office/word/2010/wordml" xmlns:w15="http://schemas.microsoft.com/office/word/2012/wordml" xmlns:w16cex="http://schemas.microsoft.com/office/word/2018/wordml/cex" xmlns:w16cid="http://schemas.microsoft.com/office/word/2016/wordml/cid" xmlns:w16="http://schemas.microsoft.com/office/word/2018/wordml" xmlns:w16du="http://schemas.microsoft.com/office/word/2023/wordml/word16du" xmlns:w16sdtdh="http://schemas.microsoft.com/office/word/2020/wordml/sdtdatahash" xmlns:w16sdtfl="http://schemas.microsoft.com/office/word/2024/wordml/sdtformatlock" xmlns:w16se="http://schemas.microsoft.com/office/word/2015/wordml/symex" xmlns:wpg="http://schemas.microsoft.com/office/word/2010/wordprocessingGroup" xmlns:wpi="http://schemas.microsoft.com/office/word/2010/wordprocessingInk" xmlns:wne="http://schemas.microsoft.com/office/word/2006/wordml" xmlns:wps="http://schemas.microsoft.com/office/word/2010/wordprocessingShape" mc:Ignorable="w14 w15 w16se w16cid w16 w16cex w16sdtdh w16sdtfl w16du wp14">
   <w:body>
     <w:p>
       <w:r>
@@ -156,6 +156,7 @@
                                 </w:rPr>
                                 <w:t xml:space="preserve">Asignatura </w:t>
                               </w:r>
+                              <w:proofErr w:type="spellStart"/>
                               <w:r>
                                 <w:rPr>
                                   <w:b/>
@@ -165,8 +166,7 @@
                                 </w:rPr>
                                 <w:t>Capstone</w:t>
                               </w:r>
-                              <w:bookmarkStart w:id="0" w:name="_GoBack"/>
-                              <w:bookmarkEnd w:id="0"/>
+                              <w:proofErr w:type="spellEnd"/>
                             </w:p>
                           </w:txbxContent>
                         </wps:txbx>
@@ -228,7 +228,7 @@
           </mc:Choice>
           <mc:Fallback>
             <w:pict>
-              <v:group w14:anchorId="2D7FCADB" id="Grupo 47" o:spid="_x0000_s1026" style="position:absolute;margin-left:-34.3pt;margin-top:2.65pt;width:518.15pt;height:117.05pt;z-index:251659264;mso-position-horizontal-relative:margin;mso-width-relative:margin" coordsize="59034,14868" o:gfxdata="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">
+              <v:group w14:anchorId="2D7FCADB" id="Grupo 47" o:spid="_x0000_s1026" style="position:absolute;margin-left:-34.3pt;margin-top:2.65pt;width:518.15pt;height:117.05pt;z-index:251659264;mso-position-horizontal-relative:margin;mso-width-relative:margin" coordsize="59034,14868" o:gfxdata="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">
                 <v:shapetype id="_x0000_t202" coordsize="21600,21600" o:spt="202" path="m,l,21600r21600,l21600,xe">
                   <v:stroke joinstyle="miter"/>
                   <v:path gradientshapeok="t" o:connecttype="rect"/>
@@ -331,6 +331,7 @@
                           </w:rPr>
                           <w:t xml:space="preserve">Asignatura </w:t>
                         </w:r>
+                        <w:proofErr w:type="spellStart"/>
                         <w:r>
                           <w:rPr>
                             <w:b/>
@@ -340,8 +341,7 @@
                           </w:rPr>
                           <w:t>Capstone</w:t>
                         </w:r>
-                        <w:bookmarkStart w:id="1" w:name="_GoBack"/>
-                        <w:bookmarkEnd w:id="1"/>
+                        <w:proofErr w:type="spellEnd"/>
                       </w:p>
                     </w:txbxContent>
                   </v:textbox>
@@ -385,6 +385,7 @@
           <w:szCs w:val="28"/>
         </w:rPr>
       </w:pPr>
+      <w:proofErr w:type="spellStart"/>
       <w:r>
         <w:rPr>
           <w:b/>
@@ -395,6 +396,7 @@
         </w:rPr>
         <w:t>Abstract</w:t>
       </w:r>
+      <w:proofErr w:type="spellEnd"/>
     </w:p>
     <w:p>
       <w:pPr>
@@ -415,8 +417,21 @@
       <w:pPr>
         <w:jc w:val="both"/>
       </w:pPr>
-      <w:r>
-        <w:t>Promaty es un sistema de gestión de solicitudes para el ciclo de vida del colaborador, pensado para una empresa del rubro construcción. Actualmente, la solicitud y aprobación de contrataciones, anexos, finiquitos, traspasos entre centros de costo, permisos y vacaciones se coordina de manera informal, sin registro ni trazabilidad, y el cálculo de remuneraciones exige mantener alineados un sistema propio y un ERP externo (Rex+), generando doble digitación y errores. Promaty centraliza estas solicitudes mediante un flujo de aprobación en dos niveles entre la jefatura de centro de costo y RRHH, con control de acceso basado en roles y sincronización automatizada (simulada) con Rex+. El proyecto se desarrolla de forma individual, autorizado por el docente, con metodología Kanban, y toma como referencia patrones de diseño validados en un sistema real de la industria de la construcción, sin utilizar datos ni documentos confidenciales del cliente.</w:t>
+      <w:proofErr w:type="spellStart"/>
+      <w:r>
+        <w:t>Promaty</w:t>
+      </w:r>
+      <w:proofErr w:type="spellEnd"/>
+      <w:r>
+        <w:t xml:space="preserve"> es un sistema de gestión de solicitudes para el ciclo de vida del colaborador, pensado para una empresa del rubro construcción. Actualmente, la solicitud y aprobación de contrataciones, anexos, finiquitos, traspasos entre centros de costo, permisos y vacaciones se coordina de manera informal, sin registro ni trazabilidad, y el cálculo de remuneraciones exige mantener alineados un sistema propio y un ERP externo (Rex+), generando doble digitación y errores. </w:t>
+      </w:r>
+      <w:proofErr w:type="spellStart"/>
+      <w:r>
+        <w:t>Promaty</w:t>
+      </w:r>
+      <w:proofErr w:type="spellEnd"/>
+      <w:r>
+        <w:t xml:space="preserve"> centraliza estas solicitudes mediante un flujo de aprobación en dos niveles entre la jefatura de centro de costo y RRHH, con control de acceso basado en roles y sincronización automatizada (simulada) con Rex+. El proyecto se desarrolla de forma individual, autorizado por el docente, con metodología Kanban, y toma como referencia patrones de diseño validados en un sistema real de la industria de la construcción, sin utilizar datos ni documentos confidenciales del cliente.</w:t>
       </w:r>
     </w:p>
     <w:p>
@@ -438,8 +453,789 @@
       <w:pPr>
         <w:jc w:val="both"/>
       </w:pPr>
-      <w:r>
-        <w:t>Promaty is a system that manages requests for the employee life cycle, designed for a company in the construction sector. Today, requests and approvals for hiring, contract changes, terminations, transfers between cost centers, and leave or vacations are handled informally, with no record and no traceability. Also, the payroll calculation needs to keep an internal system and an external payroll system (Rex+) aligned, which causes double data entry and errors. Promaty centralizes these requests with a two-level approval flow between the cost center supervisor and HR, with role-based access control and an automatic (simulated) synchronization with Rex+. The project is developed individually, with the teacher's authorization, using a Kanban methodology. It uses design patterns from a real system in the construction industry as a reference, without using any confidential client data or documents.</w:t>
+      <w:proofErr w:type="spellStart"/>
+      <w:r>
+        <w:t>Promaty</w:t>
+      </w:r>
+      <w:proofErr w:type="spellEnd"/>
+      <w:r>
+        <w:t xml:space="preserve"> </w:t>
+      </w:r>
+      <w:proofErr w:type="spellStart"/>
+      <w:r>
+        <w:t>is</w:t>
+      </w:r>
+      <w:proofErr w:type="spellEnd"/>
+      <w:r>
+        <w:t xml:space="preserve"> a </w:t>
+      </w:r>
+      <w:proofErr w:type="spellStart"/>
+      <w:r>
+        <w:t>system</w:t>
+      </w:r>
+      <w:proofErr w:type="spellEnd"/>
+      <w:r>
+        <w:t xml:space="preserve"> </w:t>
+      </w:r>
+      <w:proofErr w:type="spellStart"/>
+      <w:r>
+        <w:t>that</w:t>
+      </w:r>
+      <w:proofErr w:type="spellEnd"/>
+      <w:r>
+        <w:t xml:space="preserve"> </w:t>
+      </w:r>
+      <w:proofErr w:type="spellStart"/>
+      <w:r>
+        <w:t>manages</w:t>
+      </w:r>
+      <w:proofErr w:type="spellEnd"/>
+      <w:r>
+        <w:t xml:space="preserve"> </w:t>
+      </w:r>
+      <w:proofErr w:type="spellStart"/>
+      <w:r>
+        <w:t>requests</w:t>
+      </w:r>
+      <w:proofErr w:type="spellEnd"/>
+      <w:r>
+        <w:t xml:space="preserve"> </w:t>
+      </w:r>
+      <w:proofErr w:type="spellStart"/>
+      <w:r>
+        <w:t>for</w:t>
+      </w:r>
+      <w:proofErr w:type="spellEnd"/>
+      <w:r>
+        <w:t xml:space="preserve"> </w:t>
+      </w:r>
+      <w:proofErr w:type="spellStart"/>
+      <w:r>
+        <w:t>the</w:t>
+      </w:r>
+      <w:proofErr w:type="spellEnd"/>
+      <w:r>
+        <w:t xml:space="preserve"> </w:t>
+      </w:r>
+      <w:proofErr w:type="spellStart"/>
+      <w:r>
+        <w:t>employee</w:t>
+      </w:r>
+      <w:proofErr w:type="spellEnd"/>
+      <w:r>
+        <w:t xml:space="preserve"> </w:t>
+      </w:r>
+      <w:proofErr w:type="spellStart"/>
+      <w:r>
+        <w:t>life</w:t>
+      </w:r>
+      <w:proofErr w:type="spellEnd"/>
+      <w:r>
+        <w:t xml:space="preserve"> </w:t>
+      </w:r>
+      <w:proofErr w:type="spellStart"/>
+      <w:r>
+        <w:t>cycle</w:t>
+      </w:r>
+      <w:proofErr w:type="spellEnd"/>
+      <w:r>
+        <w:t xml:space="preserve">, </w:t>
+      </w:r>
+      <w:proofErr w:type="spellStart"/>
+      <w:r>
+        <w:t>designed</w:t>
+      </w:r>
+      <w:proofErr w:type="spellEnd"/>
+      <w:r>
+        <w:t xml:space="preserve"> </w:t>
+      </w:r>
+      <w:proofErr w:type="spellStart"/>
+      <w:r>
+        <w:t>for</w:t>
+      </w:r>
+      <w:proofErr w:type="spellEnd"/>
+      <w:r>
+        <w:t xml:space="preserve"> a </w:t>
+      </w:r>
+      <w:proofErr w:type="spellStart"/>
+      <w:r>
+        <w:t>company</w:t>
+      </w:r>
+      <w:proofErr w:type="spellEnd"/>
+      <w:r>
+        <w:t xml:space="preserve"> in </w:t>
+      </w:r>
+      <w:proofErr w:type="spellStart"/>
+      <w:r>
+        <w:t>the</w:t>
+      </w:r>
+      <w:proofErr w:type="spellEnd"/>
+      <w:r>
+        <w:t xml:space="preserve"> </w:t>
+      </w:r>
+      <w:proofErr w:type="spellStart"/>
+      <w:r>
+        <w:t>construction</w:t>
+      </w:r>
+      <w:proofErr w:type="spellEnd"/>
+      <w:r>
+        <w:t xml:space="preserve"> sector. </w:t>
+      </w:r>
+      <w:proofErr w:type="spellStart"/>
+      <w:r>
+        <w:t>Today</w:t>
+      </w:r>
+      <w:proofErr w:type="spellEnd"/>
+      <w:r>
+        <w:t xml:space="preserve">, </w:t>
+      </w:r>
+      <w:proofErr w:type="spellStart"/>
+      <w:r>
+        <w:t>requests</w:t>
+      </w:r>
+      <w:proofErr w:type="spellEnd"/>
+      <w:r>
+        <w:t xml:space="preserve"> and </w:t>
+      </w:r>
+      <w:proofErr w:type="spellStart"/>
+      <w:r>
+        <w:t>approvals</w:t>
+      </w:r>
+      <w:proofErr w:type="spellEnd"/>
+      <w:r>
+        <w:t xml:space="preserve"> </w:t>
+      </w:r>
+      <w:proofErr w:type="spellStart"/>
+      <w:r>
+        <w:t>for</w:t>
+      </w:r>
+      <w:proofErr w:type="spellEnd"/>
+      <w:r>
+        <w:t xml:space="preserve"> </w:t>
+      </w:r>
+      <w:proofErr w:type="spellStart"/>
+      <w:r>
+        <w:t>hiring</w:t>
+      </w:r>
+      <w:proofErr w:type="spellEnd"/>
+      <w:r>
+        <w:t xml:space="preserve">, </w:t>
+      </w:r>
+      <w:proofErr w:type="spellStart"/>
+      <w:r>
+        <w:t>contract</w:t>
+      </w:r>
+      <w:proofErr w:type="spellEnd"/>
+      <w:r>
+        <w:t xml:space="preserve"> </w:t>
+      </w:r>
+      <w:proofErr w:type="spellStart"/>
+      <w:r>
+        <w:t>changes</w:t>
+      </w:r>
+      <w:proofErr w:type="spellEnd"/>
+      <w:r>
+        <w:t xml:space="preserve">, </w:t>
+      </w:r>
+      <w:proofErr w:type="spellStart"/>
+      <w:r>
+        <w:t>terminations</w:t>
+      </w:r>
+      <w:proofErr w:type="spellEnd"/>
+      <w:r>
+        <w:t xml:space="preserve">, </w:t>
+      </w:r>
+      <w:proofErr w:type="spellStart"/>
+      <w:r>
+        <w:t>transfers</w:t>
+      </w:r>
+      <w:proofErr w:type="spellEnd"/>
+      <w:r>
+        <w:t xml:space="preserve"> </w:t>
+      </w:r>
+      <w:proofErr w:type="spellStart"/>
+      <w:r>
+        <w:t>between</w:t>
+      </w:r>
+      <w:proofErr w:type="spellEnd"/>
+      <w:r>
+        <w:t xml:space="preserve"> </w:t>
+      </w:r>
+      <w:proofErr w:type="spellStart"/>
+      <w:r>
+        <w:t>cost</w:t>
+      </w:r>
+      <w:proofErr w:type="spellEnd"/>
+      <w:r>
+        <w:t xml:space="preserve"> centers, and </w:t>
+      </w:r>
+      <w:proofErr w:type="spellStart"/>
+      <w:r>
+        <w:t>leave</w:t>
+      </w:r>
+      <w:proofErr w:type="spellEnd"/>
+      <w:r>
+        <w:t xml:space="preserve"> </w:t>
+      </w:r>
+      <w:proofErr w:type="spellStart"/>
+      <w:r>
+        <w:t>or</w:t>
+      </w:r>
+      <w:proofErr w:type="spellEnd"/>
+      <w:r>
+        <w:t xml:space="preserve"> </w:t>
+      </w:r>
+      <w:proofErr w:type="spellStart"/>
+      <w:r>
+        <w:t>vacations</w:t>
+      </w:r>
+      <w:proofErr w:type="spellEnd"/>
+      <w:r>
+        <w:t xml:space="preserve"> are </w:t>
+      </w:r>
+      <w:proofErr w:type="spellStart"/>
+      <w:r>
+        <w:t>handled</w:t>
+      </w:r>
+      <w:proofErr w:type="spellEnd"/>
+      <w:r>
+        <w:t xml:space="preserve"> </w:t>
+      </w:r>
+      <w:proofErr w:type="spellStart"/>
+      <w:r>
+        <w:t>informally</w:t>
+      </w:r>
+      <w:proofErr w:type="spellEnd"/>
+      <w:r>
+        <w:t xml:space="preserve">, </w:t>
+      </w:r>
+      <w:proofErr w:type="spellStart"/>
+      <w:r>
+        <w:t>with</w:t>
+      </w:r>
+      <w:proofErr w:type="spellEnd"/>
+      <w:r>
+        <w:t xml:space="preserve"> no </w:t>
+      </w:r>
+      <w:proofErr w:type="spellStart"/>
+      <w:r>
+        <w:t>record</w:t>
+      </w:r>
+      <w:proofErr w:type="spellEnd"/>
+      <w:r>
+        <w:t xml:space="preserve"> and no </w:t>
+      </w:r>
+      <w:proofErr w:type="spellStart"/>
+      <w:r>
+        <w:t>traceability</w:t>
+      </w:r>
+      <w:proofErr w:type="spellEnd"/>
+      <w:r>
+        <w:t xml:space="preserve">. Also, </w:t>
+      </w:r>
+      <w:proofErr w:type="spellStart"/>
+      <w:r>
+        <w:t>the</w:t>
+      </w:r>
+      <w:proofErr w:type="spellEnd"/>
+      <w:r>
+        <w:t xml:space="preserve"> </w:t>
+      </w:r>
+      <w:proofErr w:type="spellStart"/>
+      <w:r>
+        <w:t>payroll</w:t>
+      </w:r>
+      <w:proofErr w:type="spellEnd"/>
+      <w:r>
+        <w:t xml:space="preserve"> </w:t>
+      </w:r>
+      <w:proofErr w:type="spellStart"/>
+      <w:r>
+        <w:t>calculation</w:t>
+      </w:r>
+      <w:proofErr w:type="spellEnd"/>
+      <w:r>
+        <w:t xml:space="preserve"> </w:t>
+      </w:r>
+      <w:proofErr w:type="spellStart"/>
+      <w:r>
+        <w:t>needs</w:t>
+      </w:r>
+      <w:proofErr w:type="spellEnd"/>
+      <w:r>
+        <w:t xml:space="preserve"> </w:t>
+      </w:r>
+      <w:proofErr w:type="spellStart"/>
+      <w:r>
+        <w:t>to</w:t>
+      </w:r>
+      <w:proofErr w:type="spellEnd"/>
+      <w:r>
+        <w:t xml:space="preserve"> </w:t>
+      </w:r>
+      <w:proofErr w:type="spellStart"/>
+      <w:r>
+        <w:t>keep</w:t>
+      </w:r>
+      <w:proofErr w:type="spellEnd"/>
+      <w:r>
+        <w:t xml:space="preserve"> </w:t>
+      </w:r>
+      <w:proofErr w:type="spellStart"/>
+      <w:r>
+        <w:t>an</w:t>
+      </w:r>
+      <w:proofErr w:type="spellEnd"/>
+      <w:r>
+        <w:t xml:space="preserve"> </w:t>
+      </w:r>
+      <w:proofErr w:type="spellStart"/>
+      <w:r>
+        <w:t>internal</w:t>
+      </w:r>
+      <w:proofErr w:type="spellEnd"/>
+      <w:r>
+        <w:t xml:space="preserve"> </w:t>
+      </w:r>
+      <w:proofErr w:type="spellStart"/>
+      <w:r>
+        <w:t>system</w:t>
+      </w:r>
+      <w:proofErr w:type="spellEnd"/>
+      <w:r>
+        <w:t xml:space="preserve"> and </w:t>
+      </w:r>
+      <w:proofErr w:type="spellStart"/>
+      <w:r>
+        <w:t>an</w:t>
+      </w:r>
+      <w:proofErr w:type="spellEnd"/>
+      <w:r>
+        <w:t xml:space="preserve"> </w:t>
+      </w:r>
+      <w:proofErr w:type="spellStart"/>
+      <w:r>
+        <w:t>external</w:t>
+      </w:r>
+      <w:proofErr w:type="spellEnd"/>
+      <w:r>
+        <w:t xml:space="preserve"> </w:t>
+      </w:r>
+      <w:proofErr w:type="spellStart"/>
+      <w:r>
+        <w:t>payroll</w:t>
+      </w:r>
+      <w:proofErr w:type="spellEnd"/>
+      <w:r>
+        <w:t xml:space="preserve"> </w:t>
+      </w:r>
+      <w:proofErr w:type="spellStart"/>
+      <w:r>
+        <w:t>system</w:t>
+      </w:r>
+      <w:proofErr w:type="spellEnd"/>
+      <w:r>
+        <w:t xml:space="preserve"> (Rex+) </w:t>
+      </w:r>
+      <w:proofErr w:type="spellStart"/>
+      <w:r>
+        <w:t>aligned</w:t>
+      </w:r>
+      <w:proofErr w:type="spellEnd"/>
+      <w:r>
+        <w:t xml:space="preserve">, </w:t>
+      </w:r>
+      <w:proofErr w:type="spellStart"/>
+      <w:r>
+        <w:t>which</w:t>
+      </w:r>
+      <w:proofErr w:type="spellEnd"/>
+      <w:r>
+        <w:t xml:space="preserve"> causes </w:t>
+      </w:r>
+      <w:proofErr w:type="spellStart"/>
+      <w:r>
+        <w:t>double</w:t>
+      </w:r>
+      <w:proofErr w:type="spellEnd"/>
+      <w:r>
+        <w:t xml:space="preserve"> data </w:t>
+      </w:r>
+      <w:proofErr w:type="spellStart"/>
+      <w:r>
+        <w:t>entry</w:t>
+      </w:r>
+      <w:proofErr w:type="spellEnd"/>
+      <w:r>
+        <w:t xml:space="preserve"> and </w:t>
+      </w:r>
+      <w:proofErr w:type="spellStart"/>
+      <w:r>
+        <w:t>errors</w:t>
+      </w:r>
+      <w:proofErr w:type="spellEnd"/>
+      <w:r>
+        <w:t xml:space="preserve">. </w:t>
+      </w:r>
+      <w:proofErr w:type="spellStart"/>
+      <w:r>
+        <w:t>Promaty</w:t>
+      </w:r>
+      <w:proofErr w:type="spellEnd"/>
+      <w:r>
+        <w:t xml:space="preserve"> </w:t>
+      </w:r>
+      <w:proofErr w:type="spellStart"/>
+      <w:r>
+        <w:t>centralizes</w:t>
+      </w:r>
+      <w:proofErr w:type="spellEnd"/>
+      <w:r>
+        <w:t xml:space="preserve"> </w:t>
+      </w:r>
+      <w:proofErr w:type="spellStart"/>
+      <w:r>
+        <w:t>these</w:t>
+      </w:r>
+      <w:proofErr w:type="spellEnd"/>
+      <w:r>
+        <w:t xml:space="preserve"> </w:t>
+      </w:r>
+      <w:proofErr w:type="spellStart"/>
+      <w:r>
+        <w:t>requests</w:t>
+      </w:r>
+      <w:proofErr w:type="spellEnd"/>
+      <w:r>
+        <w:t xml:space="preserve"> </w:t>
+      </w:r>
+      <w:proofErr w:type="spellStart"/>
+      <w:r>
+        <w:t>with</w:t>
+      </w:r>
+      <w:proofErr w:type="spellEnd"/>
+      <w:r>
+        <w:t xml:space="preserve"> a </w:t>
+      </w:r>
+      <w:proofErr w:type="spellStart"/>
+      <w:r>
+        <w:t>two-level</w:t>
+      </w:r>
+      <w:proofErr w:type="spellEnd"/>
+      <w:r>
+        <w:t xml:space="preserve"> </w:t>
+      </w:r>
+      <w:proofErr w:type="spellStart"/>
+      <w:r>
+        <w:t>approval</w:t>
+      </w:r>
+      <w:proofErr w:type="spellEnd"/>
+      <w:r>
+        <w:t xml:space="preserve"> </w:t>
+      </w:r>
+      <w:proofErr w:type="spellStart"/>
+      <w:r>
+        <w:t>flow</w:t>
+      </w:r>
+      <w:proofErr w:type="spellEnd"/>
+      <w:r>
+        <w:t xml:space="preserve"> </w:t>
+      </w:r>
+      <w:proofErr w:type="spellStart"/>
+      <w:r>
+        <w:t>between</w:t>
+      </w:r>
+      <w:proofErr w:type="spellEnd"/>
+      <w:r>
+        <w:t xml:space="preserve"> </w:t>
+      </w:r>
+      <w:proofErr w:type="spellStart"/>
+      <w:r>
+        <w:t>the</w:t>
+      </w:r>
+      <w:proofErr w:type="spellEnd"/>
+      <w:r>
+        <w:t xml:space="preserve"> </w:t>
+      </w:r>
+      <w:proofErr w:type="spellStart"/>
+      <w:r>
+        <w:t>cost</w:t>
+      </w:r>
+      <w:proofErr w:type="spellEnd"/>
+      <w:r>
+        <w:t xml:space="preserve"> center supervisor and HR, </w:t>
+      </w:r>
+      <w:proofErr w:type="spellStart"/>
+      <w:r>
+        <w:t>with</w:t>
+      </w:r>
+      <w:proofErr w:type="spellEnd"/>
+      <w:r>
+        <w:t xml:space="preserve"> role-</w:t>
+      </w:r>
+      <w:proofErr w:type="spellStart"/>
+      <w:r>
+        <w:t>based</w:t>
+      </w:r>
+      <w:proofErr w:type="spellEnd"/>
+      <w:r>
+        <w:t xml:space="preserve"> </w:t>
+      </w:r>
+      <w:proofErr w:type="spellStart"/>
+      <w:r>
+        <w:t>access</w:t>
+      </w:r>
+      <w:proofErr w:type="spellEnd"/>
+      <w:r>
+        <w:t xml:space="preserve"> control and </w:t>
+      </w:r>
+      <w:proofErr w:type="spellStart"/>
+      <w:r>
+        <w:t>an</w:t>
+      </w:r>
+      <w:proofErr w:type="spellEnd"/>
+      <w:r>
+        <w:t xml:space="preserve"> </w:t>
+      </w:r>
+      <w:proofErr w:type="spellStart"/>
+      <w:r>
+        <w:t>automatic</w:t>
+      </w:r>
+      <w:proofErr w:type="spellEnd"/>
+      <w:r>
+        <w:t xml:space="preserve"> (</w:t>
+      </w:r>
+      <w:proofErr w:type="spellStart"/>
+      <w:r>
+        <w:t>simulated</w:t>
+      </w:r>
+      <w:proofErr w:type="spellEnd"/>
+      <w:r>
+        <w:t xml:space="preserve">) </w:t>
+      </w:r>
+      <w:proofErr w:type="spellStart"/>
+      <w:r>
+        <w:t>synchronization</w:t>
+      </w:r>
+      <w:proofErr w:type="spellEnd"/>
+      <w:r>
+        <w:t xml:space="preserve"> </w:t>
+      </w:r>
+      <w:proofErr w:type="spellStart"/>
+      <w:r>
+        <w:t>with</w:t>
+      </w:r>
+      <w:proofErr w:type="spellEnd"/>
+      <w:r>
+        <w:t xml:space="preserve"> Rex+. The </w:t>
+      </w:r>
+      <w:proofErr w:type="spellStart"/>
+      <w:r>
+        <w:t>project</w:t>
+      </w:r>
+      <w:proofErr w:type="spellEnd"/>
+      <w:r>
+        <w:t xml:space="preserve"> </w:t>
+      </w:r>
+      <w:proofErr w:type="spellStart"/>
+      <w:r>
+        <w:t>is</w:t>
+      </w:r>
+      <w:proofErr w:type="spellEnd"/>
+      <w:r>
+        <w:t xml:space="preserve"> </w:t>
+      </w:r>
+      <w:proofErr w:type="spellStart"/>
+      <w:r>
+        <w:t>developed</w:t>
+      </w:r>
+      <w:proofErr w:type="spellEnd"/>
+      <w:r>
+        <w:t xml:space="preserve"> </w:t>
+      </w:r>
+      <w:proofErr w:type="spellStart"/>
+      <w:r>
+        <w:t>individually</w:t>
+      </w:r>
+      <w:proofErr w:type="spellEnd"/>
+      <w:r>
+        <w:t xml:space="preserve">, </w:t>
+      </w:r>
+      <w:proofErr w:type="spellStart"/>
+      <w:r>
+        <w:t>with</w:t>
+      </w:r>
+      <w:proofErr w:type="spellEnd"/>
+      <w:r>
+        <w:t xml:space="preserve"> </w:t>
+      </w:r>
+      <w:proofErr w:type="spellStart"/>
+      <w:r>
+        <w:t>the</w:t>
+      </w:r>
+      <w:proofErr w:type="spellEnd"/>
+      <w:r>
+        <w:t xml:space="preserve"> </w:t>
+      </w:r>
+      <w:proofErr w:type="spellStart"/>
+      <w:r>
+        <w:t>teacher's</w:t>
+      </w:r>
+      <w:proofErr w:type="spellEnd"/>
+      <w:r>
+        <w:t xml:space="preserve"> </w:t>
+      </w:r>
+      <w:proofErr w:type="spellStart"/>
+      <w:r>
+        <w:t>authorization</w:t>
+      </w:r>
+      <w:proofErr w:type="spellEnd"/>
+      <w:r>
+        <w:t xml:space="preserve">, </w:t>
+      </w:r>
+      <w:proofErr w:type="spellStart"/>
+      <w:r>
+        <w:t>using</w:t>
+      </w:r>
+      <w:proofErr w:type="spellEnd"/>
+      <w:r>
+        <w:t xml:space="preserve"> a Kanban </w:t>
+      </w:r>
+      <w:proofErr w:type="spellStart"/>
+      <w:r>
+        <w:t>methodology</w:t>
+      </w:r>
+      <w:proofErr w:type="spellEnd"/>
+      <w:r>
+        <w:t xml:space="preserve">. </w:t>
+      </w:r>
+      <w:proofErr w:type="spellStart"/>
+      <w:r>
+        <w:t>It</w:t>
+      </w:r>
+      <w:proofErr w:type="spellEnd"/>
+      <w:r>
+        <w:t xml:space="preserve"> uses </w:t>
+      </w:r>
+      <w:proofErr w:type="spellStart"/>
+      <w:r>
+        <w:t>design</w:t>
+      </w:r>
+      <w:proofErr w:type="spellEnd"/>
+      <w:r>
+        <w:t xml:space="preserve"> </w:t>
+      </w:r>
+      <w:proofErr w:type="spellStart"/>
+      <w:r>
+        <w:t>patterns</w:t>
+      </w:r>
+      <w:proofErr w:type="spellEnd"/>
+      <w:r>
+        <w:t xml:space="preserve"> </w:t>
+      </w:r>
+      <w:proofErr w:type="spellStart"/>
+      <w:r>
+        <w:t>from</w:t>
+      </w:r>
+      <w:proofErr w:type="spellEnd"/>
+      <w:r>
+        <w:t xml:space="preserve"> a real </w:t>
+      </w:r>
+      <w:proofErr w:type="spellStart"/>
+      <w:r>
+        <w:t>system</w:t>
+      </w:r>
+      <w:proofErr w:type="spellEnd"/>
+      <w:r>
+        <w:t xml:space="preserve"> in </w:t>
+      </w:r>
+      <w:proofErr w:type="spellStart"/>
+      <w:r>
+        <w:t>the</w:t>
+      </w:r>
+      <w:proofErr w:type="spellEnd"/>
+      <w:r>
+        <w:t xml:space="preserve"> </w:t>
+      </w:r>
+      <w:proofErr w:type="spellStart"/>
+      <w:r>
+        <w:t>construction</w:t>
+      </w:r>
+      <w:proofErr w:type="spellEnd"/>
+      <w:r>
+        <w:t xml:space="preserve"> </w:t>
+      </w:r>
+      <w:proofErr w:type="spellStart"/>
+      <w:r>
+        <w:t>industry</w:t>
+      </w:r>
+      <w:proofErr w:type="spellEnd"/>
+      <w:r>
+        <w:t xml:space="preserve"> as a </w:t>
+      </w:r>
+      <w:proofErr w:type="spellStart"/>
+      <w:r>
+        <w:t>reference</w:t>
+      </w:r>
+      <w:proofErr w:type="spellEnd"/>
+      <w:r>
+        <w:t xml:space="preserve">, </w:t>
+      </w:r>
+      <w:proofErr w:type="spellStart"/>
+      <w:r>
+        <w:t>without</w:t>
+      </w:r>
+      <w:proofErr w:type="spellEnd"/>
+      <w:r>
+        <w:t xml:space="preserve"> </w:t>
+      </w:r>
+      <w:proofErr w:type="spellStart"/>
+      <w:r>
+        <w:t>using</w:t>
+      </w:r>
+      <w:proofErr w:type="spellEnd"/>
+      <w:r>
+        <w:t xml:space="preserve"> </w:t>
+      </w:r>
+      <w:proofErr w:type="spellStart"/>
+      <w:r>
+        <w:t>any</w:t>
+      </w:r>
+      <w:proofErr w:type="spellEnd"/>
+      <w:r>
+        <w:t xml:space="preserve"> </w:t>
+      </w:r>
+      <w:proofErr w:type="spellStart"/>
+      <w:r>
+        <w:t>confidential</w:t>
+      </w:r>
+      <w:proofErr w:type="spellEnd"/>
+      <w:r>
+        <w:t xml:space="preserve"> </w:t>
+      </w:r>
+      <w:proofErr w:type="spellStart"/>
+      <w:r>
+        <w:t>client</w:t>
+      </w:r>
+      <w:proofErr w:type="spellEnd"/>
+      <w:r>
+        <w:t xml:space="preserve"> data </w:t>
+      </w:r>
+      <w:proofErr w:type="spellStart"/>
+      <w:r>
+        <w:t>or</w:t>
+      </w:r>
+      <w:proofErr w:type="spellEnd"/>
+      <w:r>
+        <w:t xml:space="preserve"> </w:t>
+      </w:r>
+      <w:proofErr w:type="spellStart"/>
+      <w:r>
+        <w:t>documents</w:t>
+      </w:r>
+      <w:proofErr w:type="spellEnd"/>
+      <w:r>
+        <w:t>.</w:t>
       </w:r>
     </w:p>
     <w:p>
@@ -473,6 +1269,7 @@
           <w:sz w:val="32"/>
           <w:szCs w:val="32"/>
         </w:rPr>
+        <w:lastRenderedPageBreak/>
         <w:t>PARTE I</w:t>
       </w:r>
     </w:p>
@@ -795,15 +1592,15 @@
       <w:pPr>
         <w:rPr>
           <w:i/>
+          <w:color w:val="595959"/>
           <w:sz w:val="20"/>
-          <w:color w:val="595959"/>
         </w:rPr>
       </w:pPr>
       <w:r>
         <w:rPr>
           <w:i/>
+          <w:color w:val="595959"/>
           <w:sz w:val="20"/>
-          <w:color w:val="595959"/>
         </w:rPr>
         <w:t>Proyecto autorizado para desarrollo individual por el docente Marco Valenzuela, dado que se basa en un proyecto real con cliente real (consultora de TI) donde trabajo actualmente.</w:t>
       </w:r>
@@ -949,9 +1746,11 @@
                 <w:b/>
               </w:rPr>
             </w:pPr>
+            <w:proofErr w:type="spellStart"/>
             <w:r>
               <w:t>Promaty</w:t>
             </w:r>
+            <w:proofErr w:type="spellEnd"/>
           </w:p>
         </w:tc>
       </w:tr>
@@ -992,7 +1791,15 @@
               </w:rPr>
             </w:pPr>
             <w:r>
-              <w:t>Análisis y diseño de sistemas; Desarrollo de software full stack; Gestión de proyectos informáticos; Modelamiento y consulta de bases de datos.</w:t>
+              <w:t xml:space="preserve">Análisis y diseño de sistemas; Desarrollo de software full </w:t>
+            </w:r>
+            <w:proofErr w:type="spellStart"/>
+            <w:r>
+              <w:t>stack</w:t>
+            </w:r>
+            <w:proofErr w:type="spellEnd"/>
+            <w:r>
+              <w:t>; Gestión de proyectos informáticos; Modelamiento y consulta de bases de datos.</w:t>
             </w:r>
           </w:p>
         </w:tc>
@@ -1047,44 +1854,30 @@
             </w:r>
             <w:r>
               <w:br/>
-            </w:r>
-            <w:r>
               <w:t>Construir el modelo de datos que soporta los requerimientos.</w:t>
             </w:r>
             <w:r>
               <w:br/>
-            </w:r>
-            <w:r>
               <w:t>Construir el modelo arquitectónico de la solución.</w:t>
             </w:r>
             <w:r>
               <w:br/>
-            </w:r>
-            <w:r>
               <w:t>Construir programas siguiendo buenas prácticas de codificación.</w:t>
             </w:r>
             <w:r>
               <w:br/>
-            </w:r>
-            <w:r>
               <w:t>Implementar soluciones que automatizan procesos manuales.</w:t>
             </w:r>
             <w:r>
               <w:br/>
-            </w:r>
-            <w:r>
               <w:t>Aplicar control de acceso basado en roles para la seguridad del sistema.</w:t>
             </w:r>
             <w:r>
               <w:br/>
-            </w:r>
-            <w:r>
               <w:t>Gestionar el proyecto con backlog, estimación y seguimiento.</w:t>
             </w:r>
             <w:r>
               <w:br/>
-            </w:r>
-            <w:r>
               <w:t>Comunicar avances y decisiones de forma clara.</w:t>
             </w:r>
           </w:p>
@@ -1296,7 +2089,31 @@
               </w:rPr>
             </w:pPr>
             <w:r>
-              <w:t>El problema que aborda Promaty es la falta de un sistema propio que centralice el ciclo de vida del colaborador para una empresa del rubro construcción, que hoy coordina la mayoría de estas gestiones de forma informal (WhatsApp, correo, llamadas) sin registro ni trazabilidad, y debe mantener alineado un sistema propio con un ERP externo (Rex+) para el cálculo de remuneraciones, generando doble digitación y errores. Este tema es relevante para el campo laboral de Ingeniería en Informática porque combina análisis de procesos de negocio, diseño de un modelo de datos robusto y desarrollo de un sistema full stack con control de acceso, competencias centrales del perfil de egreso. La situación se sitúa en obras de construcción gestionadas por una empresa que centraliza su RRHH desde una oficina central, afectando principalmente a las jefaturas de centro de costo (sin canal formal para solicitar y aprobar gestiones de su personal) y al equipo de RRHH (que debe re-digitar manualmente los datos aprobados). El aporte de valor, simulado en este proyecto, es formalizar y dar trazabilidad a estas solicitudes, automatizando la sincronización con el ERP externo.</w:t>
+              <w:t xml:space="preserve">El problema que aborda </w:t>
+            </w:r>
+            <w:proofErr w:type="spellStart"/>
+            <w:r>
+              <w:t>Promaty</w:t>
+            </w:r>
+            <w:proofErr w:type="spellEnd"/>
+            <w:r>
+              <w:t xml:space="preserve"> es la falta de un sistema propio que centralice el ciclo de vida del colaborador para una empresa del rubro construcción, que hoy coordina la mayoría de estas gestiones de forma informal (WhatsApp, correo, llamadas) sin registro ni trazabilidad, y debe mantener alineado un sistema propio con un ERP externo (Rex+) para el cálculo de remuneraciones, generando doble digitación y errores. Este tema es relevante para el campo laboral de Ingeniería en Informática porque combina análisis de procesos de negocio, diseño de un modelo de datos robusto y desarrollo de un sistema full </w:t>
+            </w:r>
+            <w:proofErr w:type="spellStart"/>
+            <w:r>
+              <w:t>stack</w:t>
+            </w:r>
+            <w:proofErr w:type="spellEnd"/>
+            <w:r>
+              <w:t xml:space="preserve"> con control de acceso, competencias centrales del perfil de egreso. La situación se sitúa en obras de construcción gestionadas por una empresa que centraliza su RRHH desde una oficina central, afectando principalmente a las jefaturas de centro de costo (sin canal formal para solicitar y aprobar gestiones de su personal) y al equipo de RRHH (que debe </w:t>
+            </w:r>
+            <w:proofErr w:type="spellStart"/>
+            <w:r>
+              <w:t>re-digitar</w:t>
+            </w:r>
+            <w:proofErr w:type="spellEnd"/>
+            <w:r>
+              <w:t xml:space="preserve"> manualmente los datos aprobados). El aporte de valor, simulado en este proyecto, es formalizar y dar trazabilidad a estas solicitudes, automatizando la sincronización con el ERP externo.</w:t>
             </w:r>
           </w:p>
         </w:tc>
@@ -1351,8 +2168,13 @@
                 <w:lang w:eastAsia="es-CL"/>
               </w:rPr>
             </w:pPr>
-            <w:r>
-              <w:t>Promaty tiene como objetivo formalizar y dar trazabilidad al proceso de solicitud y aprobación de las gestiones del ciclo de vida del colaborador (contratación, anexos, finiquito, traspasos entre centros de costo, permisos y vacaciones), junto con la gestión de asistencia y remuneraciones, mediante un flujo de aprobación en dos niveles entre la jefatura de centro de costo y RRHH. El sistema centraliza estas solicitudes, aplica control de acceso basado en roles según el centro de costo de cada usuario, y automatiza la sincronización de los datos aprobados con Rex+ (simulado en este proyecto), evitando que RRHH deba volver a digitarlos manualmente.</w:t>
+            <w:proofErr w:type="spellStart"/>
+            <w:r>
+              <w:t>Promaty</w:t>
+            </w:r>
+            <w:proofErr w:type="spellEnd"/>
+            <w:r>
+              <w:t xml:space="preserve"> tiene como objetivo formalizar y dar trazabilidad al proceso de solicitud y aprobación de las gestiones del ciclo de vida del colaborador (contratación, anexos, finiquito, traspasos entre centros de costo, permisos y vacaciones), junto con la gestión de asistencia y remuneraciones, mediante un flujo de aprobación en dos niveles entre la jefatura de centro de costo y RRHH. El sistema centraliza estas solicitudes, aplica control de acceso basado en roles según el centro de costo de cada usuario, y automatiza la sincronización de los datos aprobados con Rex+ (simulado en este proyecto), evitando que RRHH deba volver a digitarlos manualmente.</w:t>
             </w:r>
           </w:p>
         </w:tc>
@@ -1406,8 +2228,29 @@
                 <w:lang w:eastAsia="es-CL"/>
               </w:rPr>
             </w:pPr>
-            <w:r>
-              <w:t>Promaty pone en práctica de manera directa las competencias seleccionadas: el análisis integral de los procesos de RRHH de la empresa (contratación, traslados, permisos, remuneraciones) fue necesario para definir el alcance del sistema antes de programar; el modelo de datos y la arquitectura se diseñaron para soportar ese alcance de forma escalable; la construcción del software (frontend en Vue 3, backend en Java con Spring Boot) sigue buenas prácticas de codificación documentadas; el control de acceso basado en roles es un requisito central dado que cada usuario solo debe gestionar los centros de costo que le corresponden; y la gestión del proyecto (backlog priorizado, estimación, seguimiento con Kanban) es indispensable porque lo desarrollo en solitario y debo tomar y defender cada decisión de alcance.</w:t>
+            <w:proofErr w:type="spellStart"/>
+            <w:r>
+              <w:t>Promaty</w:t>
+            </w:r>
+            <w:proofErr w:type="spellEnd"/>
+            <w:r>
+              <w:t xml:space="preserve"> pone en práctica de manera directa las competencias seleccionadas: el análisis integral de los procesos de RRHH de la empresa (contratación, traslados, permisos, remuneraciones) fue necesario para definir el alcance del sistema antes de programar; el modelo de datos y la arquitectura se diseñaron para soportar ese alcance de forma escalable; la construcción del software (</w:t>
+            </w:r>
+            <w:proofErr w:type="spellStart"/>
+            <w:r>
+              <w:t>frontend</w:t>
+            </w:r>
+            <w:proofErr w:type="spellEnd"/>
+            <w:r>
+              <w:t xml:space="preserve"> en Vue 3, </w:t>
+            </w:r>
+            <w:proofErr w:type="spellStart"/>
+            <w:r>
+              <w:t>backend</w:t>
+            </w:r>
+            <w:proofErr w:type="spellEnd"/>
+            <w:r>
+              <w:t xml:space="preserve"> en Java con Spring Boot) sigue buenas prácticas de codificación documentadas; el control de acceso basado en roles es un requisito central dado que cada usuario solo debe gestionar los centros de costo que le corresponden; y la gestión del proyecto (backlog priorizado, estimación, seguimiento con Kanban) es indispensable porque lo desarrollo en solitario y debo tomar y defender cada decisión de alcance.</w:t>
             </w:r>
           </w:p>
         </w:tc>
@@ -1455,7 +2298,22 @@
               </w:rPr>
             </w:pPr>
             <w:r>
-              <w:t>Mis intereses profesionales están en el análisis y diseño de soluciones y en la gestión de proyectos, más que en programar por sí solo — me proyecto liderando equipos de desarrollo. Promaty me exige justamente eso: analizar el proceso de negocio de RRHH de principio a fin, definir el alcance del MVP, priorizar qué construir primero, y defender cada decisión de diseño sin depender de un equipo. Desarrollar este proyecto contribuye a mi desarrollo profesional porque practico de forma concreta el rol de liderazgo técnico al que apunto: tomar decisiones de arquitectura y alcance, y comunicarlas con claridad.</w:t>
+              <w:t>Mis intereses profesionales combinan el desarrollo técnico con el análisis y diseño de soluciones y la gestión de proyectos — me proyecto liderando equipos de desarrollo, no solo ejecutando</w:t>
+            </w:r>
+            <w:r>
+              <w:t xml:space="preserve">. </w:t>
+            </w:r>
+            <w:proofErr w:type="spellStart"/>
+            <w:r>
+              <w:t>Promaty</w:t>
+            </w:r>
+            <w:proofErr w:type="spellEnd"/>
+            <w:r>
+              <w:t xml:space="preserve"> me exige justamente eso: </w:t>
+            </w:r>
+            <w:r>
+              <w:lastRenderedPageBreak/>
+              <w:t>analizar el proceso de negocio de RRHH de principio a fin, definir el alcance del MVP, priorizar qué construir primero, y defender cada decisión de diseño sin depender de un equipo. Desarrollar este proyecto contribuye a mi desarrollo profesional porque practico de forma concreta el rol de liderazgo técnico al que apunto: tomar decisiones de arquitectura y alcance, y comunicarlas con claridad.</w:t>
             </w:r>
           </w:p>
         </w:tc>
@@ -1481,6 +2339,7 @@
                 <w:rFonts w:ascii="Calibri" w:hAnsi="Calibri"/>
                 <w:color w:val="1F3864" w:themeColor="accent1" w:themeShade="80"/>
               </w:rPr>
+              <w:lastRenderedPageBreak/>
               <w:t>Factibilidad de desarrollo del Proyecto APT</w:t>
             </w:r>
           </w:p>
@@ -1503,7 +2362,31 @@
               </w:rPr>
             </w:pPr>
             <w:r>
-              <w:t>Es posible desarrollar Promaty en el marco de la asignatura Capstone considerando: el semestre completo (18 semanas, según la Carta Gantt de las tres fases), la sesión presencial semanal de taller los días jueves más el tiempo de trabajo autónomo distribuido durante la semana, y que el proyecto se desarrolla en solitario (autorizado por el docente), lo que evita tiempos de coordinación de equipo. Como materiales solo se requiere equipo propio (notebook) y herramientas gratuitas (Git/GitHub, PostgreSQL, IDE). Entre los factores externos que facilitan el desarrollo está mi experiencia previa en un sistema similar en mi trabajo actual, que me sirve como referencia de patrones de diseño ya validados. Como factor que podría dificultarlo, al trabajar en solitario, cualquier imprevisto (ej. carga laboral alta en mi trabajo) afecta directamente el avance sin poder redistribuir tareas a un equipo — se mitiga acotando el alcance a un MVP realista y priorizando los procesos críticos de RRHH por sobre funcionalidades secundarias.</w:t>
+              <w:t xml:space="preserve">Es posible desarrollar </w:t>
+            </w:r>
+            <w:proofErr w:type="spellStart"/>
+            <w:r>
+              <w:t>Promaty</w:t>
+            </w:r>
+            <w:proofErr w:type="spellEnd"/>
+            <w:r>
+              <w:t xml:space="preserve"> en el marco de la asignatura </w:t>
+            </w:r>
+            <w:proofErr w:type="spellStart"/>
+            <w:r>
+              <w:t>Capstone</w:t>
+            </w:r>
+            <w:proofErr w:type="spellEnd"/>
+            <w:r>
+              <w:t xml:space="preserve"> considerando: el semestre completo (18 semanas, según la Carta Gantt de las tres fases), la sesión presencial semanal de taller los </w:t>
+            </w:r>
+            <w:proofErr w:type="gramStart"/>
+            <w:r>
+              <w:t>días jueves</w:t>
+            </w:r>
+            <w:proofErr w:type="gramEnd"/>
+            <w:r>
+              <w:t xml:space="preserve"> más el tiempo de trabajo autónomo distribuido durante la semana, y que el proyecto se desarrolla en solitario (autorizado por el docente), lo que evita tiempos de coordinación de equipo. Como materiales solo se requiere equipo propio (notebook) y herramientas gratuitas (Git/GitHub, PostgreSQL, IDE). Entre los factores externos que facilitan el desarrollo está mi experiencia previa en un sistema similar en mi trabajo actual, que me sirve como referencia de patrones de diseño ya validados. Como factor que podría dificultarlo, al trabajar en solitario, cualquier imprevisto (ej. carga laboral alta en mi trabajo) afecta directamente el avance sin poder redistribuir tareas a un equipo — se mitiga acotando el alcance a un MVP realista y priorizando los procesos críticos de RRHH por sobre funcionalidades secundarias.</w:t>
             </w:r>
           </w:p>
         </w:tc>
@@ -1788,26 +2671,21 @@
             </w:r>
             <w:r>
               <w:br/>
-            </w:r>
-            <w:r>
               <w:t>Implementar un flujo de aprobación en dos niveles, entre la jefatura de centro de costo y RRHH, con motivo de rechazo y ciclo de corrección.</w:t>
             </w:r>
             <w:r>
               <w:br/>
-            </w:r>
-            <w:r>
               <w:t>Registrar la ficha del colaborador y el estado de cada solicitud, con trazabilidad completa.</w:t>
             </w:r>
             <w:r>
               <w:br/>
-            </w:r>
-            <w:r>
               <w:t>Automatizar la carga de los datos aprobados en Rex+ (simulado), evitando la doble digitación manual.</w:t>
             </w:r>
             <w:r>
               <w:br/>
             </w:r>
             <w:r>
+              <w:lastRenderedPageBreak/>
               <w:t>Reducir la doble digitación y los errores asociados al ingreso manual de datos en más de una plataforma.</w:t>
             </w:r>
           </w:p>
@@ -2040,7 +2918,42 @@
               </w:rPr>
             </w:pPr>
             <w:r>
-              <w:t>Trabajo con metodología Kanban: mantengo un backlog priorizado con jerarquía Épica → Historia de Usuario → Tarea, y un tablero con estados (Por Hacer / En desarrollo / Terminado) que refleja el flujo continuo de trabajo, sin sprints de duración fija. Documento checkpoints semanales como “sprint” (identificador de período) para efectos de trazabilidad (ej. Sprint Backlog, Burndown Chart), aunque no realizo ceremonias formales de Scrum (sin daily meetings ni sprint planning con equipo), dado que desarrollo el proyecto en solitario. El historial de decisiones, impedimentos y avances queda versionado en Git y documentado en un archivo de decisiones y retrospectiva, que reconstruyo bajo demanda para generar la evidencia de cada período (Daily/Review/Retrospective) cuando se requiere. Al desarrollar el proyecto de forma individual, no aplica la definición de funciones y responsabilidades por integrante de equipo.</w:t>
+              <w:t xml:space="preserve">Trabajo con metodología Kanban: mantengo un backlog priorizado con jerarquía Épica → Historia de Usuario → Tarea, y un tablero con estados (Por Hacer / En desarrollo / Terminado) que refleja el flujo continuo de trabajo, sin </w:t>
+            </w:r>
+            <w:proofErr w:type="spellStart"/>
+            <w:r>
+              <w:t>sprints</w:t>
+            </w:r>
+            <w:proofErr w:type="spellEnd"/>
+            <w:r>
+              <w:t xml:space="preserve"> de duración fija. El avance se documenta por épica completada, con historial de </w:t>
+            </w:r>
+            <w:proofErr w:type="spellStart"/>
+            <w:r>
+              <w:t>commits</w:t>
+            </w:r>
+            <w:proofErr w:type="spellEnd"/>
+            <w:r>
+              <w:t xml:space="preserve"> en Git como trazabilidad continua y un documento de decisiones de diseño que registra impedimentos y cambios relevantes. Participo en </w:t>
+            </w:r>
+            <w:proofErr w:type="spellStart"/>
+            <w:r>
+              <w:t>dailys</w:t>
+            </w:r>
+            <w:proofErr w:type="spellEnd"/>
+            <w:r>
+              <w:t xml:space="preserve"> con el Tech Leader y el equipo de desarrollo para revisión de flujo, y en reuniones con el </w:t>
+            </w:r>
+            <w:proofErr w:type="spellStart"/>
+            <w:r>
+              <w:t>Product</w:t>
+            </w:r>
+            <w:proofErr w:type="spellEnd"/>
+            <w:r>
+              <w:t xml:space="preserve"> Owner según avance de épicas. Al desarrollar la implementación de forma individual, no aplica la definición de funciones por integrante de equipo</w:t>
+            </w:r>
+            <w:r>
+              <w:t>.</w:t>
             </w:r>
           </w:p>
         </w:tc>
@@ -2118,6 +3031,7 @@
                 <w:sz w:val="28"/>
                 <w:szCs w:val="28"/>
               </w:rPr>
+              <w:lastRenderedPageBreak/>
               <w:t>6</w:t>
             </w:r>
             <w:r>
@@ -2411,7 +3325,31 @@
               </w:rPr>
             </w:pPr>
             <w:r>
-              <w:t>Historial de commits, decisiones de diseño (decisiones.md) y estado de tareas (estado-backend.yaml / estado-frontend.yaml) en promaty-tracking, promaty-backend y promaty-frontend.</w:t>
+              <w:t xml:space="preserve">Historial de </w:t>
+            </w:r>
+            <w:proofErr w:type="spellStart"/>
+            <w:r>
+              <w:t>commits</w:t>
+            </w:r>
+            <w:proofErr w:type="spellEnd"/>
+            <w:r>
+              <w:t xml:space="preserve">, decisiones de diseño y estado de tareas versionado en Git, distribuido en los repositorios </w:t>
+            </w:r>
+            <w:proofErr w:type="spellStart"/>
+            <w:r>
+              <w:t>promaty-backend</w:t>
+            </w:r>
+            <w:proofErr w:type="spellEnd"/>
+            <w:r>
+              <w:t xml:space="preserve"> y </w:t>
+            </w:r>
+            <w:proofErr w:type="spellStart"/>
+            <w:r>
+              <w:t>promaty-frontend</w:t>
+            </w:r>
+            <w:proofErr w:type="spellEnd"/>
+            <w:r>
+              <w:t>.</w:t>
             </w:r>
           </w:p>
         </w:tc>
@@ -2492,7 +3430,7 @@
               </w:rPr>
             </w:pPr>
             <w:r>
-              <w:t>Jerarquía Épica → Historia de Usuario → Tarea con estado (Por Hacer / En desarrollo / Terminado), versionada en estado-*.yaml.</w:t>
+              <w:t>Jerarquía Épica → Historia de Usuario → Tarea con estado (Por Hacer / En desarrollo / Terminado), gestionada en Jira (proyecto PCA)</w:t>
             </w:r>
           </w:p>
         </w:tc>
@@ -2573,7 +3511,7 @@
               </w:rPr>
             </w:pPr>
             <w:r>
-              <w:t>Arquitectura (architecture.md), modelo de datos, reglas de negocio (rrhh-domain.md) y alcance del MVP (rrhh-alcance.md).</w:t>
+              <w:t>Arquitectura del sistema, modelo de datos, reglas de negocio del dominio RRHH y alcance del MVP, documentados en los repositorios del proyecto.</w:t>
             </w:r>
           </w:p>
         </w:tc>
@@ -2787,7 +3725,23 @@
                 <w:rFonts w:ascii="Calibri" w:hAnsi="Calibri"/>
                 <w:color w:val="1F3864" w:themeColor="accent1" w:themeShade="80"/>
               </w:rPr>
-              <w:t>efine la planificación de tu Proyecto APT de acuerdo a lo requerido</w:t>
+              <w:t xml:space="preserve">efine la planificación de tu Proyecto APT </w:t>
+            </w:r>
+            <w:proofErr w:type="gramStart"/>
+            <w:r>
+              <w:rPr>
+                <w:rFonts w:ascii="Calibri" w:hAnsi="Calibri"/>
+                <w:color w:val="1F3864" w:themeColor="accent1" w:themeShade="80"/>
+              </w:rPr>
+              <w:t>de acuerdo a</w:t>
+            </w:r>
+            <w:proofErr w:type="gramEnd"/>
+            <w:r>
+              <w:rPr>
+                <w:rFonts w:ascii="Calibri" w:hAnsi="Calibri"/>
+                <w:color w:val="1F3864" w:themeColor="accent1" w:themeShade="80"/>
+              </w:rPr>
+              <w:t xml:space="preserve"> lo requerido</w:t>
             </w:r>
             <w:r>
               <w:rPr>
@@ -2925,14 +3879,30 @@
                 <w:rFonts w:ascii="Calibri" w:hAnsi="Calibri"/>
                 <w:color w:val="1F3864" w:themeColor="accent1" w:themeShade="80"/>
               </w:rPr>
-              <w:t xml:space="preserve">Nombre de </w:t>
-            </w:r>
-            <w:r>
-              <w:rPr>
-                <w:rFonts w:ascii="Calibri" w:hAnsi="Calibri"/>
-                <w:color w:val="1F3864" w:themeColor="accent1" w:themeShade="80"/>
-              </w:rPr>
-              <w:t xml:space="preserve"> Actividades/Tareas</w:t>
+              <w:t xml:space="preserve">Nombre </w:t>
+            </w:r>
+            <w:proofErr w:type="gramStart"/>
+            <w:r>
+              <w:rPr>
+                <w:rFonts w:ascii="Calibri" w:hAnsi="Calibri"/>
+                <w:color w:val="1F3864" w:themeColor="accent1" w:themeShade="80"/>
+              </w:rPr>
+              <w:t xml:space="preserve">de </w:t>
+            </w:r>
+            <w:r>
+              <w:rPr>
+                <w:rFonts w:ascii="Calibri" w:hAnsi="Calibri"/>
+                <w:color w:val="1F3864" w:themeColor="accent1" w:themeShade="80"/>
+              </w:rPr>
+              <w:t xml:space="preserve"> Actividades</w:t>
+            </w:r>
+            <w:proofErr w:type="gramEnd"/>
+            <w:r>
+              <w:rPr>
+                <w:rFonts w:ascii="Calibri" w:hAnsi="Calibri"/>
+                <w:color w:val="1F3864" w:themeColor="accent1" w:themeShade="80"/>
+              </w:rPr>
+              <w:t>/Tareas</w:t>
             </w:r>
           </w:p>
         </w:tc>
@@ -3092,7 +4062,11 @@
               </w:rPr>
             </w:pPr>
             <w:r>
-              <w:t>Analizar de forma integral los procesos de negocio para proponer una solución; Gestionar proyectos informáticos.</w:t>
+              <w:t xml:space="preserve">Analizar de forma integral los procesos de negocio para proponer una </w:t>
+            </w:r>
+            <w:r>
+              <w:lastRenderedPageBreak/>
+              <w:t>solución; Gestionar proyectos informáticos.</w:t>
             </w:r>
           </w:p>
         </w:tc>
@@ -3110,8 +4084,14 @@
               </w:rPr>
             </w:pPr>
             <w:r>
-              <w:t>Definición y análisis de Promaty</w:t>
-            </w:r>
+              <w:lastRenderedPageBreak/>
+              <w:t xml:space="preserve">Definición y análisis de </w:t>
+            </w:r>
+            <w:proofErr w:type="spellStart"/>
+            <w:r>
+              <w:t>Promaty</w:t>
+            </w:r>
+            <w:proofErr w:type="spellEnd"/>
           </w:p>
         </w:tc>
         <w:tc>
@@ -3128,7 +4108,11 @@
               </w:rPr>
             </w:pPr>
             <w:r>
-              <w:t>Levantamiento del contexto, problemática, objetivos, metodología y plan de trabajo del proyecto.</w:t>
+              <w:t xml:space="preserve">Levantamiento del contexto, problemática, objetivos, metodología y </w:t>
+            </w:r>
+            <w:r>
+              <w:lastRenderedPageBreak/>
+              <w:t>plan de trabajo del proyecto.</w:t>
             </w:r>
           </w:p>
         </w:tc>
@@ -3149,7 +4133,12 @@
               </w:rPr>
             </w:pPr>
             <w:r>
-              <w:t>Documentación del sistema real (solo como referencia de patrones), plantillas Duoc UC.</w:t>
+              <w:lastRenderedPageBreak/>
+              <w:t xml:space="preserve">Documentación del sistema real (solo como referencia de patrones), </w:t>
+            </w:r>
+            <w:r>
+              <w:lastRenderedPageBreak/>
+              <w:t>plantillas Duoc UC.</w:t>
             </w:r>
           </w:p>
         </w:tc>
@@ -3173,6 +4162,7 @@
               </w:rPr>
             </w:pPr>
             <w:r>
+              <w:lastRenderedPageBreak/>
               <w:t>Semanas 1-4</w:t>
             </w:r>
           </w:p>
@@ -3213,7 +4203,11 @@
               </w:rPr>
             </w:pPr>
             <w:r>
-              <w:t>Facilitador: experiencia previa en un sistema similar. Obstaculizador: acotar el alcance a un MVP viable en el tiempo disponible.</w:t>
+              <w:t xml:space="preserve">Facilitador: experiencia previa en un sistema similar. </w:t>
+            </w:r>
+            <w:r>
+              <w:lastRenderedPageBreak/>
+              <w:t>Obstaculizador: acotar el alcance a un MVP viable en el tiempo disponible.</w:t>
             </w:r>
           </w:p>
         </w:tc>
@@ -3239,6 +4233,7 @@
               </w:rPr>
             </w:pPr>
             <w:r>
+              <w:lastRenderedPageBreak/>
               <w:t>Construir el modelo de datos; Construir el modelo arquitectónico; Construir programas siguiendo buenas prácticas de codificación; Implementar soluciones que automatizan procesos manuales.</w:t>
             </w:r>
           </w:p>
@@ -3260,7 +4255,23 @@
               </w:rPr>
             </w:pPr>
             <w:r>
-              <w:t>Desarrollo del MVP (backend y frontend)</w:t>
+              <w:t>Desarrollo del MVP (</w:t>
+            </w:r>
+            <w:proofErr w:type="spellStart"/>
+            <w:r>
+              <w:t>backend</w:t>
+            </w:r>
+            <w:proofErr w:type="spellEnd"/>
+            <w:r>
+              <w:t xml:space="preserve"> y </w:t>
+            </w:r>
+            <w:proofErr w:type="spellStart"/>
+            <w:r>
+              <w:t>frontend</w:t>
+            </w:r>
+            <w:proofErr w:type="spellEnd"/>
+            <w:r>
+              <w:t>)</w:t>
             </w:r>
           </w:p>
         </w:tc>
@@ -3281,7 +4292,32 @@
               </w:rPr>
             </w:pPr>
             <w:r>
-              <w:t>Implementación de los módulos del ciclo de vida del colaborador (ficha, contrato, permisos/vacaciones, asistencia, remuneraciones), con Vue 3 en frontend y Spring Boot en backend.</w:t>
+              <w:t xml:space="preserve">Implementación de los módulos del ciclo de vida del colaborador </w:t>
+            </w:r>
+            <w:r>
+              <w:t>(</w:t>
+            </w:r>
+            <w:r>
+              <w:t>contratación, anexos, finiquito, traspasos entre centros de costo, permisos y vacaciones, asistencia y remuneraciones</w:t>
+            </w:r>
+            <w:r>
+              <w:t xml:space="preserve">), con Vue 3 en </w:t>
+            </w:r>
+            <w:proofErr w:type="spellStart"/>
+            <w:r>
+              <w:t>frontend</w:t>
+            </w:r>
+            <w:proofErr w:type="spellEnd"/>
+            <w:r>
+              <w:t xml:space="preserve"> y Spring Boot en </w:t>
+            </w:r>
+            <w:proofErr w:type="spellStart"/>
+            <w:r>
+              <w:t>backend</w:t>
+            </w:r>
+            <w:proofErr w:type="spellEnd"/>
+            <w:r>
+              <w:t>.</w:t>
             </w:r>
           </w:p>
         </w:tc>
@@ -3302,7 +4338,23 @@
               </w:rPr>
             </w:pPr>
             <w:r>
-              <w:t>Java, Spring Boot, PostgreSQL, Vue 3, TypeScript, Vuetify, Git/GitHub.</w:t>
+              <w:t xml:space="preserve">Java, Spring Boot, PostgreSQL, Vue 3, </w:t>
+            </w:r>
+            <w:proofErr w:type="spellStart"/>
+            <w:r>
+              <w:t>TypeScript</w:t>
+            </w:r>
+            <w:proofErr w:type="spellEnd"/>
+            <w:r>
+              <w:t xml:space="preserve">, </w:t>
+            </w:r>
+            <w:proofErr w:type="spellStart"/>
+            <w:r>
+              <w:t>Vuetify</w:t>
+            </w:r>
+            <w:proofErr w:type="spellEnd"/>
+            <w:r>
+              <w:t>, Git/GitHub.</w:t>
             </w:r>
           </w:p>
         </w:tc>
@@ -3638,6 +4690,7 @@
                 <w:rFonts w:ascii="Calibri" w:hAnsi="Calibri"/>
                 <w:color w:val="1F3864" w:themeColor="accent1" w:themeShade="80"/>
               </w:rPr>
+              <w:lastRenderedPageBreak/>
               <w:t xml:space="preserve">Busca un formato de Carta Gantt que te acomode y organiza en </w:t>
             </w:r>
             <w:r>
@@ -3710,26 +4763,26 @@
         <w:tblLook w:val="04A0" w:firstRow="1" w:lastRow="0" w:firstColumn="1" w:lastColumn="0" w:noHBand="0" w:noVBand="1"/>
       </w:tblPr>
       <w:tblGrid>
-        <w:gridCol w:w="1351"/>
-        <w:gridCol w:w="536"/>
+        <w:gridCol w:w="1384"/>
+        <w:gridCol w:w="533"/>
+        <w:gridCol w:w="519"/>
+        <w:gridCol w:w="520"/>
+        <w:gridCol w:w="523"/>
+        <w:gridCol w:w="520"/>
+        <w:gridCol w:w="520"/>
+        <w:gridCol w:w="521"/>
+        <w:gridCol w:w="521"/>
+        <w:gridCol w:w="521"/>
         <w:gridCol w:w="522"/>
-        <w:gridCol w:w="523"/>
-        <w:gridCol w:w="526"/>
-        <w:gridCol w:w="523"/>
-        <w:gridCol w:w="523"/>
-        <w:gridCol w:w="523"/>
-        <w:gridCol w:w="523"/>
-        <w:gridCol w:w="523"/>
-        <w:gridCol w:w="523"/>
-        <w:gridCol w:w="523"/>
-        <w:gridCol w:w="523"/>
-        <w:gridCol w:w="525"/>
-        <w:gridCol w:w="525"/>
-        <w:gridCol w:w="525"/>
+        <w:gridCol w:w="522"/>
+        <w:gridCol w:w="522"/>
+        <w:gridCol w:w="524"/>
+        <w:gridCol w:w="524"/>
+        <w:gridCol w:w="524"/>
         <w:gridCol w:w="7"/>
-        <w:gridCol w:w="518"/>
-        <w:gridCol w:w="525"/>
-        <w:gridCol w:w="525"/>
+        <w:gridCol w:w="517"/>
+        <w:gridCol w:w="524"/>
+        <w:gridCol w:w="524"/>
         <w:gridCol w:w="10"/>
       </w:tblGrid>
       <w:tr>
@@ -4341,8 +5394,13 @@
               </w:rPr>
             </w:pPr>
             <w:r>
-              <w:t>Definición y análisis de Promaty</w:t>
-            </w:r>
+              <w:t xml:space="preserve">Definición y análisis de </w:t>
+            </w:r>
+            <w:proofErr w:type="spellStart"/>
+            <w:r>
+              <w:t>Promaty</w:t>
+            </w:r>
+            <w:proofErr w:type="spellEnd"/>
           </w:p>
         </w:tc>
         <w:tc>
@@ -4660,7 +5718,23 @@
               </w:rPr>
             </w:pPr>
             <w:r>
-              <w:t>Desarrollo del MVP (backend y frontend)</w:t>
+              <w:t>Desarrollo del MVP (</w:t>
+            </w:r>
+            <w:proofErr w:type="spellStart"/>
+            <w:r>
+              <w:t>backend</w:t>
+            </w:r>
+            <w:proofErr w:type="spellEnd"/>
+            <w:r>
+              <w:t xml:space="preserve"> y </w:t>
+            </w:r>
+            <w:proofErr w:type="spellStart"/>
+            <w:r>
+              <w:t>frontend</w:t>
+            </w:r>
+            <w:proofErr w:type="spellEnd"/>
+            <w:r>
+              <w:t>)</w:t>
             </w:r>
           </w:p>
         </w:tc>
@@ -5294,6 +6368,7 @@
           <w:szCs w:val="28"/>
         </w:rPr>
       </w:pPr>
+      <w:proofErr w:type="spellStart"/>
       <w:r>
         <w:rPr>
           <w:b/>
@@ -5304,13 +6379,643 @@
         </w:rPr>
         <w:t>Conclusions</w:t>
       </w:r>
+      <w:proofErr w:type="spellEnd"/>
     </w:p>
     <w:p>
       <w:pPr>
         <w:jc w:val="both"/>
       </w:pPr>
-      <w:r>
-        <w:t>Defining Promaty in this phase helped me confirm that the project is realistic for the time I have this semester. I decided to focus the scope on the most critical HR processes — the employee life cycle, approvals, attendance, and payroll — and leave other features, like the recruitment module, out of the MVP. This process also helped me connect the project with my professional interests: I want to work more on analysis, project management, and future leadership roles, not only on writing code. The plan of work and the Gantt chart give me a clear way to check my progress in the next phases.</w:t>
+      <w:proofErr w:type="spellStart"/>
+      <w:r>
+        <w:t>Defining</w:t>
+      </w:r>
+      <w:proofErr w:type="spellEnd"/>
+      <w:r>
+        <w:t xml:space="preserve"> </w:t>
+      </w:r>
+      <w:proofErr w:type="spellStart"/>
+      <w:r>
+        <w:t>Promaty</w:t>
+      </w:r>
+      <w:proofErr w:type="spellEnd"/>
+      <w:r>
+        <w:t xml:space="preserve"> in </w:t>
+      </w:r>
+      <w:proofErr w:type="spellStart"/>
+      <w:r>
+        <w:t>this</w:t>
+      </w:r>
+      <w:proofErr w:type="spellEnd"/>
+      <w:r>
+        <w:t xml:space="preserve"> </w:t>
+      </w:r>
+      <w:proofErr w:type="spellStart"/>
+      <w:r>
+        <w:t>phase</w:t>
+      </w:r>
+      <w:proofErr w:type="spellEnd"/>
+      <w:r>
+        <w:t xml:space="preserve"> </w:t>
+      </w:r>
+      <w:proofErr w:type="spellStart"/>
+      <w:r>
+        <w:t>helped</w:t>
+      </w:r>
+      <w:proofErr w:type="spellEnd"/>
+      <w:r>
+        <w:t xml:space="preserve"> me </w:t>
+      </w:r>
+      <w:proofErr w:type="spellStart"/>
+      <w:r>
+        <w:t>confirm</w:t>
+      </w:r>
+      <w:proofErr w:type="spellEnd"/>
+      <w:r>
+        <w:t xml:space="preserve"> </w:t>
+      </w:r>
+      <w:proofErr w:type="spellStart"/>
+      <w:r>
+        <w:t>that</w:t>
+      </w:r>
+      <w:proofErr w:type="spellEnd"/>
+      <w:r>
+        <w:t xml:space="preserve"> </w:t>
+      </w:r>
+      <w:proofErr w:type="spellStart"/>
+      <w:r>
+        <w:t>the</w:t>
+      </w:r>
+      <w:proofErr w:type="spellEnd"/>
+      <w:r>
+        <w:t xml:space="preserve"> </w:t>
+      </w:r>
+      <w:proofErr w:type="spellStart"/>
+      <w:r>
+        <w:t>project</w:t>
+      </w:r>
+      <w:proofErr w:type="spellEnd"/>
+      <w:r>
+        <w:t xml:space="preserve"> </w:t>
+      </w:r>
+      <w:proofErr w:type="spellStart"/>
+      <w:r>
+        <w:t>is</w:t>
+      </w:r>
+      <w:proofErr w:type="spellEnd"/>
+      <w:r>
+        <w:t xml:space="preserve"> </w:t>
+      </w:r>
+      <w:proofErr w:type="spellStart"/>
+      <w:r>
+        <w:t>realistic</w:t>
+      </w:r>
+      <w:proofErr w:type="spellEnd"/>
+      <w:r>
+        <w:t xml:space="preserve"> </w:t>
+      </w:r>
+      <w:proofErr w:type="spellStart"/>
+      <w:r>
+        <w:t>for</w:t>
+      </w:r>
+      <w:proofErr w:type="spellEnd"/>
+      <w:r>
+        <w:t xml:space="preserve"> </w:t>
+      </w:r>
+      <w:proofErr w:type="spellStart"/>
+      <w:r>
+        <w:t>the</w:t>
+      </w:r>
+      <w:proofErr w:type="spellEnd"/>
+      <w:r>
+        <w:t xml:space="preserve"> time I </w:t>
+      </w:r>
+      <w:proofErr w:type="spellStart"/>
+      <w:r>
+        <w:t>have</w:t>
+      </w:r>
+      <w:proofErr w:type="spellEnd"/>
+      <w:r>
+        <w:t xml:space="preserve"> </w:t>
+      </w:r>
+      <w:proofErr w:type="spellStart"/>
+      <w:r>
+        <w:t>this</w:t>
+      </w:r>
+      <w:proofErr w:type="spellEnd"/>
+      <w:r>
+        <w:t xml:space="preserve"> </w:t>
+      </w:r>
+      <w:proofErr w:type="spellStart"/>
+      <w:r>
+        <w:t>semester</w:t>
+      </w:r>
+      <w:proofErr w:type="spellEnd"/>
+      <w:r>
+        <w:t xml:space="preserve">. I </w:t>
+      </w:r>
+      <w:proofErr w:type="spellStart"/>
+      <w:r>
+        <w:t>decided</w:t>
+      </w:r>
+      <w:proofErr w:type="spellEnd"/>
+      <w:r>
+        <w:t xml:space="preserve"> </w:t>
+      </w:r>
+      <w:proofErr w:type="spellStart"/>
+      <w:r>
+        <w:t>to</w:t>
+      </w:r>
+      <w:proofErr w:type="spellEnd"/>
+      <w:r>
+        <w:t xml:space="preserve"> </w:t>
+      </w:r>
+      <w:proofErr w:type="spellStart"/>
+      <w:r>
+        <w:t>focus</w:t>
+      </w:r>
+      <w:proofErr w:type="spellEnd"/>
+      <w:r>
+        <w:t xml:space="preserve"> </w:t>
+      </w:r>
+      <w:proofErr w:type="spellStart"/>
+      <w:r>
+        <w:t>the</w:t>
+      </w:r>
+      <w:proofErr w:type="spellEnd"/>
+      <w:r>
+        <w:t xml:space="preserve"> </w:t>
+      </w:r>
+      <w:proofErr w:type="spellStart"/>
+      <w:r>
+        <w:t>scope</w:t>
+      </w:r>
+      <w:proofErr w:type="spellEnd"/>
+      <w:r>
+        <w:t xml:space="preserve"> </w:t>
+      </w:r>
+      <w:proofErr w:type="spellStart"/>
+      <w:r>
+        <w:t>on</w:t>
+      </w:r>
+      <w:proofErr w:type="spellEnd"/>
+      <w:r>
+        <w:t xml:space="preserve"> </w:t>
+      </w:r>
+      <w:proofErr w:type="spellStart"/>
+      <w:r>
+        <w:t>the</w:t>
+      </w:r>
+      <w:proofErr w:type="spellEnd"/>
+      <w:r>
+        <w:t xml:space="preserve"> </w:t>
+      </w:r>
+      <w:proofErr w:type="spellStart"/>
+      <w:r>
+        <w:t>most</w:t>
+      </w:r>
+      <w:proofErr w:type="spellEnd"/>
+      <w:r>
+        <w:t xml:space="preserve"> </w:t>
+      </w:r>
+      <w:proofErr w:type="spellStart"/>
+      <w:r>
+        <w:t>critical</w:t>
+      </w:r>
+      <w:proofErr w:type="spellEnd"/>
+      <w:r>
+        <w:t xml:space="preserve"> HR </w:t>
+      </w:r>
+      <w:proofErr w:type="spellStart"/>
+      <w:r>
+        <w:t>processes</w:t>
+      </w:r>
+      <w:proofErr w:type="spellEnd"/>
+      <w:r>
+        <w:t xml:space="preserve"> — </w:t>
+      </w:r>
+      <w:proofErr w:type="spellStart"/>
+      <w:r>
+        <w:t>the</w:t>
+      </w:r>
+      <w:proofErr w:type="spellEnd"/>
+      <w:r>
+        <w:t xml:space="preserve"> </w:t>
+      </w:r>
+      <w:proofErr w:type="spellStart"/>
+      <w:r>
+        <w:t>employee</w:t>
+      </w:r>
+      <w:proofErr w:type="spellEnd"/>
+      <w:r>
+        <w:t xml:space="preserve"> </w:t>
+      </w:r>
+      <w:proofErr w:type="spellStart"/>
+      <w:r>
+        <w:t>life</w:t>
+      </w:r>
+      <w:proofErr w:type="spellEnd"/>
+      <w:r>
+        <w:t xml:space="preserve"> </w:t>
+      </w:r>
+      <w:proofErr w:type="spellStart"/>
+      <w:r>
+        <w:t>cycle</w:t>
+      </w:r>
+      <w:proofErr w:type="spellEnd"/>
+      <w:r>
+        <w:t xml:space="preserve">, </w:t>
+      </w:r>
+      <w:proofErr w:type="spellStart"/>
+      <w:r>
+        <w:t>approvals</w:t>
+      </w:r>
+      <w:proofErr w:type="spellEnd"/>
+      <w:r>
+        <w:t xml:space="preserve">, </w:t>
+      </w:r>
+      <w:proofErr w:type="spellStart"/>
+      <w:r>
+        <w:t>attendance</w:t>
+      </w:r>
+      <w:proofErr w:type="spellEnd"/>
+      <w:r>
+        <w:t xml:space="preserve">, and </w:t>
+      </w:r>
+      <w:proofErr w:type="spellStart"/>
+      <w:r>
+        <w:t>payroll</w:t>
+      </w:r>
+      <w:proofErr w:type="spellEnd"/>
+      <w:r>
+        <w:t xml:space="preserve"> — and </w:t>
+      </w:r>
+      <w:proofErr w:type="spellStart"/>
+      <w:r>
+        <w:t>leave</w:t>
+      </w:r>
+      <w:proofErr w:type="spellEnd"/>
+      <w:r>
+        <w:t xml:space="preserve"> </w:t>
+      </w:r>
+      <w:proofErr w:type="spellStart"/>
+      <w:r>
+        <w:t>other</w:t>
+      </w:r>
+      <w:proofErr w:type="spellEnd"/>
+      <w:r>
+        <w:t xml:space="preserve"> </w:t>
+      </w:r>
+      <w:proofErr w:type="spellStart"/>
+      <w:r>
+        <w:t>features</w:t>
+      </w:r>
+      <w:proofErr w:type="spellEnd"/>
+      <w:r>
+        <w:t xml:space="preserve">, </w:t>
+      </w:r>
+      <w:proofErr w:type="spellStart"/>
+      <w:r>
+        <w:t>like</w:t>
+      </w:r>
+      <w:proofErr w:type="spellEnd"/>
+      <w:r>
+        <w:t xml:space="preserve"> </w:t>
+      </w:r>
+      <w:proofErr w:type="spellStart"/>
+      <w:r>
+        <w:t>the</w:t>
+      </w:r>
+      <w:proofErr w:type="spellEnd"/>
+      <w:r>
+        <w:t xml:space="preserve"> </w:t>
+      </w:r>
+      <w:proofErr w:type="spellStart"/>
+      <w:r>
+        <w:t>recruitment</w:t>
+      </w:r>
+      <w:proofErr w:type="spellEnd"/>
+      <w:r>
+        <w:t xml:space="preserve"> module, </w:t>
+      </w:r>
+      <w:proofErr w:type="spellStart"/>
+      <w:r>
+        <w:t>out</w:t>
+      </w:r>
+      <w:proofErr w:type="spellEnd"/>
+      <w:r>
+        <w:t xml:space="preserve"> </w:t>
+      </w:r>
+      <w:proofErr w:type="spellStart"/>
+      <w:r>
+        <w:t>of</w:t>
+      </w:r>
+      <w:proofErr w:type="spellEnd"/>
+      <w:r>
+        <w:t xml:space="preserve"> </w:t>
+      </w:r>
+      <w:proofErr w:type="spellStart"/>
+      <w:r>
+        <w:t>the</w:t>
+      </w:r>
+      <w:proofErr w:type="spellEnd"/>
+      <w:r>
+        <w:t xml:space="preserve"> MVP. </w:t>
+      </w:r>
+      <w:proofErr w:type="spellStart"/>
+      <w:r>
+        <w:t>This</w:t>
+      </w:r>
+      <w:proofErr w:type="spellEnd"/>
+      <w:r>
+        <w:t xml:space="preserve"> </w:t>
+      </w:r>
+      <w:proofErr w:type="spellStart"/>
+      <w:r>
+        <w:t>process</w:t>
+      </w:r>
+      <w:proofErr w:type="spellEnd"/>
+      <w:r>
+        <w:t xml:space="preserve"> </w:t>
+      </w:r>
+      <w:proofErr w:type="spellStart"/>
+      <w:r>
+        <w:t>also</w:t>
+      </w:r>
+      <w:proofErr w:type="spellEnd"/>
+      <w:r>
+        <w:t xml:space="preserve"> </w:t>
+      </w:r>
+      <w:proofErr w:type="spellStart"/>
+      <w:r>
+        <w:t>helped</w:t>
+      </w:r>
+      <w:proofErr w:type="spellEnd"/>
+      <w:r>
+        <w:t xml:space="preserve"> me </w:t>
+      </w:r>
+      <w:proofErr w:type="spellStart"/>
+      <w:r>
+        <w:t>connect</w:t>
+      </w:r>
+      <w:proofErr w:type="spellEnd"/>
+      <w:r>
+        <w:t xml:space="preserve"> </w:t>
+      </w:r>
+      <w:proofErr w:type="spellStart"/>
+      <w:r>
+        <w:t>the</w:t>
+      </w:r>
+      <w:proofErr w:type="spellEnd"/>
+      <w:r>
+        <w:t xml:space="preserve"> </w:t>
+      </w:r>
+      <w:proofErr w:type="spellStart"/>
+      <w:r>
+        <w:t>project</w:t>
+      </w:r>
+      <w:proofErr w:type="spellEnd"/>
+      <w:r>
+        <w:t xml:space="preserve"> </w:t>
+      </w:r>
+      <w:proofErr w:type="spellStart"/>
+      <w:r>
+        <w:t>with</w:t>
+      </w:r>
+      <w:proofErr w:type="spellEnd"/>
+      <w:r>
+        <w:t xml:space="preserve"> </w:t>
+      </w:r>
+      <w:proofErr w:type="spellStart"/>
+      <w:r>
+        <w:t>my</w:t>
+      </w:r>
+      <w:proofErr w:type="spellEnd"/>
+      <w:r>
+        <w:t xml:space="preserve"> </w:t>
+      </w:r>
+      <w:proofErr w:type="spellStart"/>
+      <w:r>
+        <w:t>professional</w:t>
+      </w:r>
+      <w:proofErr w:type="spellEnd"/>
+      <w:r>
+        <w:t xml:space="preserve"> </w:t>
+      </w:r>
+      <w:proofErr w:type="spellStart"/>
+      <w:r>
+        <w:t>interests</w:t>
+      </w:r>
+      <w:proofErr w:type="spellEnd"/>
+      <w:r>
+        <w:t xml:space="preserve">: I </w:t>
+      </w:r>
+      <w:proofErr w:type="spellStart"/>
+      <w:r>
+        <w:t>want</w:t>
+      </w:r>
+      <w:proofErr w:type="spellEnd"/>
+      <w:r>
+        <w:t xml:space="preserve"> </w:t>
+      </w:r>
+      <w:proofErr w:type="spellStart"/>
+      <w:r>
+        <w:t>to</w:t>
+      </w:r>
+      <w:proofErr w:type="spellEnd"/>
+      <w:r>
+        <w:t xml:space="preserve"> </w:t>
+      </w:r>
+      <w:proofErr w:type="spellStart"/>
+      <w:r>
+        <w:t>work</w:t>
+      </w:r>
+      <w:proofErr w:type="spellEnd"/>
+      <w:r>
+        <w:t xml:space="preserve"> more </w:t>
+      </w:r>
+      <w:proofErr w:type="spellStart"/>
+      <w:r>
+        <w:t>on</w:t>
+      </w:r>
+      <w:proofErr w:type="spellEnd"/>
+      <w:r>
+        <w:t xml:space="preserve"> </w:t>
+      </w:r>
+      <w:proofErr w:type="spellStart"/>
+      <w:r>
+        <w:t>analysis</w:t>
+      </w:r>
+      <w:proofErr w:type="spellEnd"/>
+      <w:r>
+        <w:t xml:space="preserve">, </w:t>
+      </w:r>
+      <w:proofErr w:type="spellStart"/>
+      <w:r>
+        <w:t>project</w:t>
+      </w:r>
+      <w:proofErr w:type="spellEnd"/>
+      <w:r>
+        <w:t xml:space="preserve"> </w:t>
+      </w:r>
+      <w:proofErr w:type="spellStart"/>
+      <w:r>
+        <w:t>management</w:t>
+      </w:r>
+      <w:proofErr w:type="spellEnd"/>
+      <w:r>
+        <w:t xml:space="preserve">, and future </w:t>
+      </w:r>
+      <w:proofErr w:type="spellStart"/>
+      <w:r>
+        <w:t>leadership</w:t>
+      </w:r>
+      <w:proofErr w:type="spellEnd"/>
+      <w:r>
+        <w:t xml:space="preserve"> roles, </w:t>
+      </w:r>
+      <w:proofErr w:type="spellStart"/>
+      <w:r>
+        <w:t>not</w:t>
+      </w:r>
+      <w:proofErr w:type="spellEnd"/>
+      <w:r>
+        <w:t xml:space="preserve"> </w:t>
+      </w:r>
+      <w:proofErr w:type="spellStart"/>
+      <w:r>
+        <w:t>only</w:t>
+      </w:r>
+      <w:proofErr w:type="spellEnd"/>
+      <w:r>
+        <w:t xml:space="preserve"> </w:t>
+      </w:r>
+      <w:proofErr w:type="spellStart"/>
+      <w:r>
+        <w:t>on</w:t>
+      </w:r>
+      <w:proofErr w:type="spellEnd"/>
+      <w:r>
+        <w:t xml:space="preserve"> </w:t>
+      </w:r>
+      <w:proofErr w:type="spellStart"/>
+      <w:r>
+        <w:t>writing</w:t>
+      </w:r>
+      <w:proofErr w:type="spellEnd"/>
+      <w:r>
+        <w:t xml:space="preserve"> </w:t>
+      </w:r>
+      <w:proofErr w:type="spellStart"/>
+      <w:r>
+        <w:t>code</w:t>
+      </w:r>
+      <w:proofErr w:type="spellEnd"/>
+      <w:r>
+        <w:t xml:space="preserve">. The plan </w:t>
+      </w:r>
+      <w:proofErr w:type="spellStart"/>
+      <w:r>
+        <w:t>of</w:t>
+      </w:r>
+      <w:proofErr w:type="spellEnd"/>
+      <w:r>
+        <w:t xml:space="preserve"> </w:t>
+      </w:r>
+      <w:proofErr w:type="spellStart"/>
+      <w:r>
+        <w:t>work</w:t>
+      </w:r>
+      <w:proofErr w:type="spellEnd"/>
+      <w:r>
+        <w:t xml:space="preserve"> and </w:t>
+      </w:r>
+      <w:proofErr w:type="spellStart"/>
+      <w:r>
+        <w:t>the</w:t>
+      </w:r>
+      <w:proofErr w:type="spellEnd"/>
+      <w:r>
+        <w:t xml:space="preserve"> Gantt chart </w:t>
+      </w:r>
+      <w:proofErr w:type="spellStart"/>
+      <w:r>
+        <w:t>give</w:t>
+      </w:r>
+      <w:proofErr w:type="spellEnd"/>
+      <w:r>
+        <w:t xml:space="preserve"> me a </w:t>
+      </w:r>
+      <w:proofErr w:type="spellStart"/>
+      <w:r>
+        <w:t>clear</w:t>
+      </w:r>
+      <w:proofErr w:type="spellEnd"/>
+      <w:r>
+        <w:t xml:space="preserve"> </w:t>
+      </w:r>
+      <w:proofErr w:type="spellStart"/>
+      <w:r>
+        <w:t>way</w:t>
+      </w:r>
+      <w:proofErr w:type="spellEnd"/>
+      <w:r>
+        <w:t xml:space="preserve"> </w:t>
+      </w:r>
+      <w:proofErr w:type="spellStart"/>
+      <w:r>
+        <w:t>to</w:t>
+      </w:r>
+      <w:proofErr w:type="spellEnd"/>
+      <w:r>
+        <w:t xml:space="preserve"> </w:t>
+      </w:r>
+      <w:proofErr w:type="spellStart"/>
+      <w:r>
+        <w:t>check</w:t>
+      </w:r>
+      <w:proofErr w:type="spellEnd"/>
+      <w:r>
+        <w:t xml:space="preserve"> </w:t>
+      </w:r>
+      <w:proofErr w:type="spellStart"/>
+      <w:r>
+        <w:t>my</w:t>
+      </w:r>
+      <w:proofErr w:type="spellEnd"/>
+      <w:r>
+        <w:t xml:space="preserve"> </w:t>
+      </w:r>
+      <w:proofErr w:type="spellStart"/>
+      <w:r>
+        <w:t>progress</w:t>
+      </w:r>
+      <w:proofErr w:type="spellEnd"/>
+      <w:r>
+        <w:t xml:space="preserve"> in </w:t>
+      </w:r>
+      <w:proofErr w:type="spellStart"/>
+      <w:r>
+        <w:t>the</w:t>
+      </w:r>
+      <w:proofErr w:type="spellEnd"/>
+      <w:r>
+        <w:t xml:space="preserve"> </w:t>
+      </w:r>
+      <w:proofErr w:type="spellStart"/>
+      <w:r>
+        <w:t>next</w:t>
+      </w:r>
+      <w:proofErr w:type="spellEnd"/>
+      <w:r>
+        <w:t xml:space="preserve"> </w:t>
+      </w:r>
+      <w:proofErr w:type="spellStart"/>
+      <w:r>
+        <w:t>phases</w:t>
+      </w:r>
+      <w:proofErr w:type="spellEnd"/>
+      <w:r>
+        <w:t>.</w:t>
       </w:r>
     </w:p>
     <w:p>
@@ -5323,6 +7028,7 @@
           <w:szCs w:val="28"/>
         </w:rPr>
       </w:pPr>
+      <w:proofErr w:type="spellStart"/>
       <w:r>
         <w:rPr>
           <w:b/>
@@ -5333,13 +7039,879 @@
         </w:rPr>
         <w:t>Reflection</w:t>
       </w:r>
+      <w:proofErr w:type="spellEnd"/>
     </w:p>
     <w:p>
       <w:pPr>
         <w:jc w:val="both"/>
       </w:pPr>
       <w:r>
-        <w:t>Working on this definition phase alone was a new experience for me, because in my previous portfolio project I worked in a team. I learned that when you work alone, you need to make every decision by yourself, and you also need to explain your reasons very clearly, because there is no one else to discuss the idea with before you write it down. It was challenging to reduce the scope of the project to something I can really finish in one semester, but I think this exercise made my planning skills stronger. I also realized that my real interest is not just building the system, but understanding the business problem first. This phase confirmed that Promaty is a good project for me, because it lets me practice both technical and leadership skills at the same time.</w:t>
+        <w:t xml:space="preserve">Working </w:t>
+      </w:r>
+      <w:proofErr w:type="spellStart"/>
+      <w:r>
+        <w:t>on</w:t>
+      </w:r>
+      <w:proofErr w:type="spellEnd"/>
+      <w:r>
+        <w:t xml:space="preserve"> </w:t>
+      </w:r>
+      <w:proofErr w:type="spellStart"/>
+      <w:r>
+        <w:t>this</w:t>
+      </w:r>
+      <w:proofErr w:type="spellEnd"/>
+      <w:r>
+        <w:t xml:space="preserve"> </w:t>
+      </w:r>
+      <w:proofErr w:type="spellStart"/>
+      <w:r>
+        <w:t>definition</w:t>
+      </w:r>
+      <w:proofErr w:type="spellEnd"/>
+      <w:r>
+        <w:t xml:space="preserve"> </w:t>
+      </w:r>
+      <w:proofErr w:type="spellStart"/>
+      <w:r>
+        <w:t>phase</w:t>
+      </w:r>
+      <w:proofErr w:type="spellEnd"/>
+      <w:r>
+        <w:t xml:space="preserve"> alone </w:t>
+      </w:r>
+      <w:proofErr w:type="spellStart"/>
+      <w:r>
+        <w:t>was</w:t>
+      </w:r>
+      <w:proofErr w:type="spellEnd"/>
+      <w:r>
+        <w:t xml:space="preserve"> a new </w:t>
+      </w:r>
+      <w:proofErr w:type="spellStart"/>
+      <w:r>
+        <w:t>experience</w:t>
+      </w:r>
+      <w:proofErr w:type="spellEnd"/>
+      <w:r>
+        <w:t xml:space="preserve"> </w:t>
+      </w:r>
+      <w:proofErr w:type="spellStart"/>
+      <w:r>
+        <w:t>for</w:t>
+      </w:r>
+      <w:proofErr w:type="spellEnd"/>
+      <w:r>
+        <w:t xml:space="preserve"> me, </w:t>
+      </w:r>
+      <w:proofErr w:type="spellStart"/>
+      <w:r>
+        <w:t>because</w:t>
+      </w:r>
+      <w:proofErr w:type="spellEnd"/>
+      <w:r>
+        <w:t xml:space="preserve"> in </w:t>
+      </w:r>
+      <w:proofErr w:type="spellStart"/>
+      <w:r>
+        <w:t>my</w:t>
+      </w:r>
+      <w:proofErr w:type="spellEnd"/>
+      <w:r>
+        <w:t xml:space="preserve"> </w:t>
+      </w:r>
+      <w:proofErr w:type="spellStart"/>
+      <w:r>
+        <w:t>previous</w:t>
+      </w:r>
+      <w:proofErr w:type="spellEnd"/>
+      <w:r>
+        <w:t xml:space="preserve"> </w:t>
+      </w:r>
+      <w:proofErr w:type="gramStart"/>
+      <w:r>
+        <w:t>portfolio</w:t>
+      </w:r>
+      <w:proofErr w:type="gramEnd"/>
+      <w:r>
+        <w:t xml:space="preserve"> </w:t>
+      </w:r>
+      <w:proofErr w:type="spellStart"/>
+      <w:r>
+        <w:t>project</w:t>
+      </w:r>
+      <w:proofErr w:type="spellEnd"/>
+      <w:r>
+        <w:t xml:space="preserve"> I </w:t>
+      </w:r>
+      <w:proofErr w:type="spellStart"/>
+      <w:r>
+        <w:t>worked</w:t>
+      </w:r>
+      <w:proofErr w:type="spellEnd"/>
+      <w:r>
+        <w:t xml:space="preserve"> in a </w:t>
+      </w:r>
+      <w:proofErr w:type="spellStart"/>
+      <w:r>
+        <w:t>team</w:t>
+      </w:r>
+      <w:proofErr w:type="spellEnd"/>
+      <w:r>
+        <w:t xml:space="preserve">. I </w:t>
+      </w:r>
+      <w:proofErr w:type="spellStart"/>
+      <w:r>
+        <w:t>learned</w:t>
+      </w:r>
+      <w:proofErr w:type="spellEnd"/>
+      <w:r>
+        <w:t xml:space="preserve"> </w:t>
+      </w:r>
+      <w:proofErr w:type="spellStart"/>
+      <w:r>
+        <w:t>that</w:t>
+      </w:r>
+      <w:proofErr w:type="spellEnd"/>
+      <w:r>
+        <w:t xml:space="preserve"> </w:t>
+      </w:r>
+      <w:proofErr w:type="spellStart"/>
+      <w:r>
+        <w:t>when</w:t>
+      </w:r>
+      <w:proofErr w:type="spellEnd"/>
+      <w:r>
+        <w:t xml:space="preserve"> </w:t>
+      </w:r>
+      <w:proofErr w:type="spellStart"/>
+      <w:r>
+        <w:t>you</w:t>
+      </w:r>
+      <w:proofErr w:type="spellEnd"/>
+      <w:r>
+        <w:t xml:space="preserve"> </w:t>
+      </w:r>
+      <w:proofErr w:type="spellStart"/>
+      <w:r>
+        <w:t>work</w:t>
+      </w:r>
+      <w:proofErr w:type="spellEnd"/>
+      <w:r>
+        <w:t xml:space="preserve"> alone, </w:t>
+      </w:r>
+      <w:proofErr w:type="spellStart"/>
+      <w:r>
+        <w:t>you</w:t>
+      </w:r>
+      <w:proofErr w:type="spellEnd"/>
+      <w:r>
+        <w:t xml:space="preserve"> </w:t>
+      </w:r>
+      <w:proofErr w:type="spellStart"/>
+      <w:r>
+        <w:t>need</w:t>
+      </w:r>
+      <w:proofErr w:type="spellEnd"/>
+      <w:r>
+        <w:t xml:space="preserve"> </w:t>
+      </w:r>
+      <w:proofErr w:type="spellStart"/>
+      <w:r>
+        <w:t>to</w:t>
+      </w:r>
+      <w:proofErr w:type="spellEnd"/>
+      <w:r>
+        <w:t xml:space="preserve"> </w:t>
+      </w:r>
+      <w:proofErr w:type="spellStart"/>
+      <w:r>
+        <w:t>make</w:t>
+      </w:r>
+      <w:proofErr w:type="spellEnd"/>
+      <w:r>
+        <w:t xml:space="preserve"> </w:t>
+      </w:r>
+      <w:proofErr w:type="spellStart"/>
+      <w:r>
+        <w:t>every</w:t>
+      </w:r>
+      <w:proofErr w:type="spellEnd"/>
+      <w:r>
+        <w:t xml:space="preserve"> </w:t>
+      </w:r>
+      <w:proofErr w:type="spellStart"/>
+      <w:r>
+        <w:t>decision</w:t>
+      </w:r>
+      <w:proofErr w:type="spellEnd"/>
+      <w:r>
+        <w:t xml:space="preserve"> </w:t>
+      </w:r>
+      <w:proofErr w:type="spellStart"/>
+      <w:r>
+        <w:t>by</w:t>
+      </w:r>
+      <w:proofErr w:type="spellEnd"/>
+      <w:r>
+        <w:t xml:space="preserve"> </w:t>
+      </w:r>
+      <w:proofErr w:type="spellStart"/>
+      <w:r>
+        <w:t>yourself</w:t>
+      </w:r>
+      <w:proofErr w:type="spellEnd"/>
+      <w:r>
+        <w:t xml:space="preserve">, and </w:t>
+      </w:r>
+      <w:proofErr w:type="spellStart"/>
+      <w:r>
+        <w:t>you</w:t>
+      </w:r>
+      <w:proofErr w:type="spellEnd"/>
+      <w:r>
+        <w:t xml:space="preserve"> </w:t>
+      </w:r>
+      <w:proofErr w:type="spellStart"/>
+      <w:r>
+        <w:t>also</w:t>
+      </w:r>
+      <w:proofErr w:type="spellEnd"/>
+      <w:r>
+        <w:t xml:space="preserve"> </w:t>
+      </w:r>
+      <w:proofErr w:type="spellStart"/>
+      <w:r>
+        <w:t>need</w:t>
+      </w:r>
+      <w:proofErr w:type="spellEnd"/>
+      <w:r>
+        <w:t xml:space="preserve"> </w:t>
+      </w:r>
+      <w:proofErr w:type="spellStart"/>
+      <w:r>
+        <w:t>to</w:t>
+      </w:r>
+      <w:proofErr w:type="spellEnd"/>
+      <w:r>
+        <w:t xml:space="preserve"> </w:t>
+      </w:r>
+      <w:proofErr w:type="spellStart"/>
+      <w:r>
+        <w:t>explain</w:t>
+      </w:r>
+      <w:proofErr w:type="spellEnd"/>
+      <w:r>
+        <w:t xml:space="preserve"> </w:t>
+      </w:r>
+      <w:proofErr w:type="spellStart"/>
+      <w:r>
+        <w:t>your</w:t>
+      </w:r>
+      <w:proofErr w:type="spellEnd"/>
+      <w:r>
+        <w:t xml:space="preserve"> </w:t>
+      </w:r>
+      <w:proofErr w:type="spellStart"/>
+      <w:r>
+        <w:t>reasons</w:t>
+      </w:r>
+      <w:proofErr w:type="spellEnd"/>
+      <w:r>
+        <w:t xml:space="preserve"> </w:t>
+      </w:r>
+      <w:proofErr w:type="spellStart"/>
+      <w:r>
+        <w:t>very</w:t>
+      </w:r>
+      <w:proofErr w:type="spellEnd"/>
+      <w:r>
+        <w:t xml:space="preserve"> </w:t>
+      </w:r>
+      <w:proofErr w:type="spellStart"/>
+      <w:r>
+        <w:t>clearly</w:t>
+      </w:r>
+      <w:proofErr w:type="spellEnd"/>
+      <w:r>
+        <w:t xml:space="preserve">, </w:t>
+      </w:r>
+      <w:proofErr w:type="spellStart"/>
+      <w:r>
+        <w:t>because</w:t>
+      </w:r>
+      <w:proofErr w:type="spellEnd"/>
+      <w:r>
+        <w:t xml:space="preserve"> </w:t>
+      </w:r>
+      <w:proofErr w:type="spellStart"/>
+      <w:r>
+        <w:t>there</w:t>
+      </w:r>
+      <w:proofErr w:type="spellEnd"/>
+      <w:r>
+        <w:t xml:space="preserve"> </w:t>
+      </w:r>
+      <w:proofErr w:type="spellStart"/>
+      <w:r>
+        <w:t>is</w:t>
+      </w:r>
+      <w:proofErr w:type="spellEnd"/>
+      <w:r>
+        <w:t xml:space="preserve"> no one </w:t>
+      </w:r>
+      <w:proofErr w:type="spellStart"/>
+      <w:r>
+        <w:t>else</w:t>
+      </w:r>
+      <w:proofErr w:type="spellEnd"/>
+      <w:r>
+        <w:t xml:space="preserve"> </w:t>
+      </w:r>
+      <w:proofErr w:type="spellStart"/>
+      <w:r>
+        <w:t>to</w:t>
+      </w:r>
+      <w:proofErr w:type="spellEnd"/>
+      <w:r>
+        <w:t xml:space="preserve"> </w:t>
+      </w:r>
+      <w:proofErr w:type="spellStart"/>
+      <w:r>
+        <w:t>discuss</w:t>
+      </w:r>
+      <w:proofErr w:type="spellEnd"/>
+      <w:r>
+        <w:t xml:space="preserve"> </w:t>
+      </w:r>
+      <w:proofErr w:type="spellStart"/>
+      <w:r>
+        <w:t>the</w:t>
+      </w:r>
+      <w:proofErr w:type="spellEnd"/>
+      <w:r>
+        <w:t xml:space="preserve"> idea </w:t>
+      </w:r>
+      <w:proofErr w:type="spellStart"/>
+      <w:r>
+        <w:t>with</w:t>
+      </w:r>
+      <w:proofErr w:type="spellEnd"/>
+      <w:r>
+        <w:t xml:space="preserve"> </w:t>
+      </w:r>
+      <w:proofErr w:type="spellStart"/>
+      <w:r>
+        <w:t>before</w:t>
+      </w:r>
+      <w:proofErr w:type="spellEnd"/>
+      <w:r>
+        <w:t xml:space="preserve"> </w:t>
+      </w:r>
+      <w:proofErr w:type="spellStart"/>
+      <w:r>
+        <w:t>you</w:t>
+      </w:r>
+      <w:proofErr w:type="spellEnd"/>
+      <w:r>
+        <w:t xml:space="preserve"> </w:t>
+      </w:r>
+      <w:proofErr w:type="spellStart"/>
+      <w:r>
+        <w:t>write</w:t>
+      </w:r>
+      <w:proofErr w:type="spellEnd"/>
+      <w:r>
+        <w:t xml:space="preserve"> </w:t>
+      </w:r>
+      <w:proofErr w:type="spellStart"/>
+      <w:r>
+        <w:t>it</w:t>
+      </w:r>
+      <w:proofErr w:type="spellEnd"/>
+      <w:r>
+        <w:t xml:space="preserve"> </w:t>
+      </w:r>
+      <w:proofErr w:type="spellStart"/>
+      <w:r>
+        <w:t>down</w:t>
+      </w:r>
+      <w:proofErr w:type="spellEnd"/>
+      <w:r>
+        <w:t xml:space="preserve">. </w:t>
+      </w:r>
+      <w:proofErr w:type="spellStart"/>
+      <w:r>
+        <w:t>It</w:t>
+      </w:r>
+      <w:proofErr w:type="spellEnd"/>
+      <w:r>
+        <w:t xml:space="preserve"> </w:t>
+      </w:r>
+      <w:proofErr w:type="spellStart"/>
+      <w:r>
+        <w:t>was</w:t>
+      </w:r>
+      <w:proofErr w:type="spellEnd"/>
+      <w:r>
+        <w:t xml:space="preserve"> </w:t>
+      </w:r>
+      <w:proofErr w:type="spellStart"/>
+      <w:r>
+        <w:t>challenging</w:t>
+      </w:r>
+      <w:proofErr w:type="spellEnd"/>
+      <w:r>
+        <w:t xml:space="preserve"> </w:t>
+      </w:r>
+      <w:proofErr w:type="spellStart"/>
+      <w:r>
+        <w:t>to</w:t>
+      </w:r>
+      <w:proofErr w:type="spellEnd"/>
+      <w:r>
+        <w:t xml:space="preserve"> reduce </w:t>
+      </w:r>
+      <w:proofErr w:type="spellStart"/>
+      <w:r>
+        <w:t>the</w:t>
+      </w:r>
+      <w:proofErr w:type="spellEnd"/>
+      <w:r>
+        <w:t xml:space="preserve"> </w:t>
+      </w:r>
+      <w:proofErr w:type="spellStart"/>
+      <w:r>
+        <w:t>scope</w:t>
+      </w:r>
+      <w:proofErr w:type="spellEnd"/>
+      <w:r>
+        <w:t xml:space="preserve"> </w:t>
+      </w:r>
+      <w:proofErr w:type="spellStart"/>
+      <w:r>
+        <w:t>of</w:t>
+      </w:r>
+      <w:proofErr w:type="spellEnd"/>
+      <w:r>
+        <w:t xml:space="preserve"> </w:t>
+      </w:r>
+      <w:proofErr w:type="spellStart"/>
+      <w:r>
+        <w:t>the</w:t>
+      </w:r>
+      <w:proofErr w:type="spellEnd"/>
+      <w:r>
+        <w:t xml:space="preserve"> </w:t>
+      </w:r>
+      <w:proofErr w:type="spellStart"/>
+      <w:r>
+        <w:t>project</w:t>
+      </w:r>
+      <w:proofErr w:type="spellEnd"/>
+      <w:r>
+        <w:t xml:space="preserve"> </w:t>
+      </w:r>
+      <w:proofErr w:type="spellStart"/>
+      <w:r>
+        <w:t>to</w:t>
+      </w:r>
+      <w:proofErr w:type="spellEnd"/>
+      <w:r>
+        <w:t xml:space="preserve"> </w:t>
+      </w:r>
+      <w:proofErr w:type="spellStart"/>
+      <w:r>
+        <w:t>something</w:t>
+      </w:r>
+      <w:proofErr w:type="spellEnd"/>
+      <w:r>
+        <w:t xml:space="preserve"> I can </w:t>
+      </w:r>
+      <w:proofErr w:type="spellStart"/>
+      <w:r>
+        <w:t>really</w:t>
+      </w:r>
+      <w:proofErr w:type="spellEnd"/>
+      <w:r>
+        <w:t xml:space="preserve"> </w:t>
+      </w:r>
+      <w:proofErr w:type="spellStart"/>
+      <w:r>
+        <w:t>finish</w:t>
+      </w:r>
+      <w:proofErr w:type="spellEnd"/>
+      <w:r>
+        <w:t xml:space="preserve"> in one </w:t>
+      </w:r>
+      <w:proofErr w:type="spellStart"/>
+      <w:r>
+        <w:t>semester</w:t>
+      </w:r>
+      <w:proofErr w:type="spellEnd"/>
+      <w:r>
+        <w:t xml:space="preserve">, </w:t>
+      </w:r>
+      <w:proofErr w:type="spellStart"/>
+      <w:r>
+        <w:t>but</w:t>
+      </w:r>
+      <w:proofErr w:type="spellEnd"/>
+      <w:r>
+        <w:t xml:space="preserve"> I </w:t>
+      </w:r>
+      <w:proofErr w:type="spellStart"/>
+      <w:r>
+        <w:t>think</w:t>
+      </w:r>
+      <w:proofErr w:type="spellEnd"/>
+      <w:r>
+        <w:t xml:space="preserve"> </w:t>
+      </w:r>
+      <w:proofErr w:type="spellStart"/>
+      <w:r>
+        <w:t>this</w:t>
+      </w:r>
+      <w:proofErr w:type="spellEnd"/>
+      <w:r>
+        <w:t xml:space="preserve"> </w:t>
+      </w:r>
+      <w:proofErr w:type="spellStart"/>
+      <w:r>
+        <w:t>exercise</w:t>
+      </w:r>
+      <w:proofErr w:type="spellEnd"/>
+      <w:r>
+        <w:t xml:space="preserve"> </w:t>
+      </w:r>
+      <w:proofErr w:type="spellStart"/>
+      <w:r>
+        <w:t>made</w:t>
+      </w:r>
+      <w:proofErr w:type="spellEnd"/>
+      <w:r>
+        <w:t xml:space="preserve"> </w:t>
+      </w:r>
+      <w:proofErr w:type="spellStart"/>
+      <w:r>
+        <w:t>my</w:t>
+      </w:r>
+      <w:proofErr w:type="spellEnd"/>
+      <w:r>
+        <w:t xml:space="preserve"> </w:t>
+      </w:r>
+      <w:proofErr w:type="spellStart"/>
+      <w:r>
+        <w:t>planning</w:t>
+      </w:r>
+      <w:proofErr w:type="spellEnd"/>
+      <w:r>
+        <w:t xml:space="preserve"> </w:t>
+      </w:r>
+      <w:proofErr w:type="spellStart"/>
+      <w:r>
+        <w:t>skills</w:t>
+      </w:r>
+      <w:proofErr w:type="spellEnd"/>
+      <w:r>
+        <w:t xml:space="preserve"> </w:t>
+      </w:r>
+      <w:proofErr w:type="spellStart"/>
+      <w:r>
+        <w:t>stronger</w:t>
+      </w:r>
+      <w:proofErr w:type="spellEnd"/>
+      <w:r>
+        <w:t xml:space="preserve">. I </w:t>
+      </w:r>
+      <w:proofErr w:type="spellStart"/>
+      <w:r>
+        <w:t>also</w:t>
+      </w:r>
+      <w:proofErr w:type="spellEnd"/>
+      <w:r>
+        <w:t xml:space="preserve"> </w:t>
+      </w:r>
+      <w:proofErr w:type="spellStart"/>
+      <w:r>
+        <w:t>realized</w:t>
+      </w:r>
+      <w:proofErr w:type="spellEnd"/>
+      <w:r>
+        <w:t xml:space="preserve"> </w:t>
+      </w:r>
+      <w:proofErr w:type="spellStart"/>
+      <w:r>
+        <w:t>that</w:t>
+      </w:r>
+      <w:proofErr w:type="spellEnd"/>
+      <w:r>
+        <w:t xml:space="preserve"> </w:t>
+      </w:r>
+      <w:proofErr w:type="spellStart"/>
+      <w:r>
+        <w:t>my</w:t>
+      </w:r>
+      <w:proofErr w:type="spellEnd"/>
+      <w:r>
+        <w:t xml:space="preserve"> real </w:t>
+      </w:r>
+      <w:proofErr w:type="spellStart"/>
+      <w:r>
+        <w:t>interest</w:t>
+      </w:r>
+      <w:proofErr w:type="spellEnd"/>
+      <w:r>
+        <w:t xml:space="preserve"> </w:t>
+      </w:r>
+      <w:proofErr w:type="spellStart"/>
+      <w:r>
+        <w:t>is</w:t>
+      </w:r>
+      <w:proofErr w:type="spellEnd"/>
+      <w:r>
+        <w:t xml:space="preserve"> </w:t>
+      </w:r>
+      <w:proofErr w:type="spellStart"/>
+      <w:r>
+        <w:t>not</w:t>
+      </w:r>
+      <w:proofErr w:type="spellEnd"/>
+      <w:r>
+        <w:t xml:space="preserve"> </w:t>
+      </w:r>
+      <w:proofErr w:type="spellStart"/>
+      <w:r>
+        <w:t>just</w:t>
+      </w:r>
+      <w:proofErr w:type="spellEnd"/>
+      <w:r>
+        <w:t xml:space="preserve"> </w:t>
+      </w:r>
+      <w:proofErr w:type="spellStart"/>
+      <w:r>
+        <w:t>building</w:t>
+      </w:r>
+      <w:proofErr w:type="spellEnd"/>
+      <w:r>
+        <w:t xml:space="preserve"> </w:t>
+      </w:r>
+      <w:proofErr w:type="spellStart"/>
+      <w:r>
+        <w:t>the</w:t>
+      </w:r>
+      <w:proofErr w:type="spellEnd"/>
+      <w:r>
+        <w:t xml:space="preserve"> </w:t>
+      </w:r>
+      <w:proofErr w:type="spellStart"/>
+      <w:r>
+        <w:t>system</w:t>
+      </w:r>
+      <w:proofErr w:type="spellEnd"/>
+      <w:r>
+        <w:t xml:space="preserve">, </w:t>
+      </w:r>
+      <w:proofErr w:type="spellStart"/>
+      <w:r>
+        <w:t>but</w:t>
+      </w:r>
+      <w:proofErr w:type="spellEnd"/>
+      <w:r>
+        <w:t xml:space="preserve"> </w:t>
+      </w:r>
+      <w:proofErr w:type="spellStart"/>
+      <w:r>
+        <w:t>understanding</w:t>
+      </w:r>
+      <w:proofErr w:type="spellEnd"/>
+      <w:r>
+        <w:t xml:space="preserve"> </w:t>
+      </w:r>
+      <w:proofErr w:type="spellStart"/>
+      <w:r>
+        <w:t>the</w:t>
+      </w:r>
+      <w:proofErr w:type="spellEnd"/>
+      <w:r>
+        <w:t xml:space="preserve"> </w:t>
+      </w:r>
+      <w:proofErr w:type="spellStart"/>
+      <w:r>
+        <w:t>business</w:t>
+      </w:r>
+      <w:proofErr w:type="spellEnd"/>
+      <w:r>
+        <w:t xml:space="preserve"> </w:t>
+      </w:r>
+      <w:proofErr w:type="spellStart"/>
+      <w:r>
+        <w:t>problem</w:t>
+      </w:r>
+      <w:proofErr w:type="spellEnd"/>
+      <w:r>
+        <w:t xml:space="preserve"> </w:t>
+      </w:r>
+      <w:proofErr w:type="spellStart"/>
+      <w:r>
+        <w:t>first</w:t>
+      </w:r>
+      <w:proofErr w:type="spellEnd"/>
+      <w:r>
+        <w:t xml:space="preserve">. </w:t>
+      </w:r>
+      <w:proofErr w:type="spellStart"/>
+      <w:r>
+        <w:t>This</w:t>
+      </w:r>
+      <w:proofErr w:type="spellEnd"/>
+      <w:r>
+        <w:t xml:space="preserve"> </w:t>
+      </w:r>
+      <w:proofErr w:type="spellStart"/>
+      <w:r>
+        <w:t>phase</w:t>
+      </w:r>
+      <w:proofErr w:type="spellEnd"/>
+      <w:r>
+        <w:t xml:space="preserve"> </w:t>
+      </w:r>
+      <w:proofErr w:type="spellStart"/>
+      <w:r>
+        <w:t>confirmed</w:t>
+      </w:r>
+      <w:proofErr w:type="spellEnd"/>
+      <w:r>
+        <w:t xml:space="preserve"> </w:t>
+      </w:r>
+      <w:proofErr w:type="spellStart"/>
+      <w:r>
+        <w:t>that</w:t>
+      </w:r>
+      <w:proofErr w:type="spellEnd"/>
+      <w:r>
+        <w:t xml:space="preserve"> </w:t>
+      </w:r>
+      <w:proofErr w:type="spellStart"/>
+      <w:r>
+        <w:t>Promaty</w:t>
+      </w:r>
+      <w:proofErr w:type="spellEnd"/>
+      <w:r>
+        <w:t xml:space="preserve"> </w:t>
+      </w:r>
+      <w:proofErr w:type="spellStart"/>
+      <w:r>
+        <w:t>is</w:t>
+      </w:r>
+      <w:proofErr w:type="spellEnd"/>
+      <w:r>
+        <w:t xml:space="preserve"> a </w:t>
+      </w:r>
+      <w:proofErr w:type="spellStart"/>
+      <w:r>
+        <w:lastRenderedPageBreak/>
+        <w:t>good</w:t>
+      </w:r>
+      <w:proofErr w:type="spellEnd"/>
+      <w:r>
+        <w:t xml:space="preserve"> </w:t>
+      </w:r>
+      <w:proofErr w:type="spellStart"/>
+      <w:r>
+        <w:t>project</w:t>
+      </w:r>
+      <w:proofErr w:type="spellEnd"/>
+      <w:r>
+        <w:t xml:space="preserve"> </w:t>
+      </w:r>
+      <w:proofErr w:type="spellStart"/>
+      <w:r>
+        <w:t>for</w:t>
+      </w:r>
+      <w:proofErr w:type="spellEnd"/>
+      <w:r>
+        <w:t xml:space="preserve"> me, </w:t>
+      </w:r>
+      <w:proofErr w:type="spellStart"/>
+      <w:r>
+        <w:t>because</w:t>
+      </w:r>
+      <w:proofErr w:type="spellEnd"/>
+      <w:r>
+        <w:t xml:space="preserve"> </w:t>
+      </w:r>
+      <w:proofErr w:type="spellStart"/>
+      <w:r>
+        <w:t>it</w:t>
+      </w:r>
+      <w:proofErr w:type="spellEnd"/>
+      <w:r>
+        <w:t xml:space="preserve"> </w:t>
+      </w:r>
+      <w:proofErr w:type="spellStart"/>
+      <w:r>
+        <w:t>lets</w:t>
+      </w:r>
+      <w:proofErr w:type="spellEnd"/>
+      <w:r>
+        <w:t xml:space="preserve"> me </w:t>
+      </w:r>
+      <w:proofErr w:type="spellStart"/>
+      <w:r>
+        <w:t>practice</w:t>
+      </w:r>
+      <w:proofErr w:type="spellEnd"/>
+      <w:r>
+        <w:t xml:space="preserve"> </w:t>
+      </w:r>
+      <w:proofErr w:type="spellStart"/>
+      <w:r>
+        <w:t>both</w:t>
+      </w:r>
+      <w:proofErr w:type="spellEnd"/>
+      <w:r>
+        <w:t xml:space="preserve"> </w:t>
+      </w:r>
+      <w:proofErr w:type="spellStart"/>
+      <w:r>
+        <w:t>technical</w:t>
+      </w:r>
+      <w:proofErr w:type="spellEnd"/>
+      <w:r>
+        <w:t xml:space="preserve"> and </w:t>
+      </w:r>
+      <w:proofErr w:type="spellStart"/>
+      <w:r>
+        <w:t>leadership</w:t>
+      </w:r>
+      <w:proofErr w:type="spellEnd"/>
+      <w:r>
+        <w:t xml:space="preserve"> </w:t>
+      </w:r>
+      <w:proofErr w:type="spellStart"/>
+      <w:r>
+        <w:t>skills</w:t>
+      </w:r>
+      <w:proofErr w:type="spellEnd"/>
+      <w:r>
+        <w:t xml:space="preserve"> at </w:t>
+      </w:r>
+      <w:proofErr w:type="spellStart"/>
+      <w:r>
+        <w:t>the</w:t>
+      </w:r>
+      <w:proofErr w:type="spellEnd"/>
+      <w:r>
+        <w:t xml:space="preserve"> </w:t>
+      </w:r>
+      <w:proofErr w:type="spellStart"/>
+      <w:r>
+        <w:t>same</w:t>
+      </w:r>
+      <w:proofErr w:type="spellEnd"/>
+      <w:r>
+        <w:t xml:space="preserve"> time.</w:t>
       </w:r>
     </w:p>
     <w:p/>
@@ -5355,7 +7927,7 @@
 </file>
 
 <file path=word/endnotes.xml><?xml version="1.0" encoding="utf-8"?>
-<w:endnotes xmlns:wpc="http://schemas.microsoft.com/office/word/2010/wordprocessingCanvas" xmlns:cx="http://schemas.microsoft.com/office/drawing/2014/chartex" xmlns:mc="http://schemas.openxmlformats.org/markup-compatibility/2006" xmlns:o="urn:schemas-microsoft-com:office:office" xmlns:r="http://schemas.openxmlformats.org/officeDocument/2006/relationships" xmlns:m="http://schemas.openxmlformats.org/officeDocument/2006/math" xmlns:v="urn:schemas-microsoft-com:vml" xmlns:wp14="http://schemas.microsoft.com/office/word/2010/wordprocessingDrawing" xmlns:wp="http://schemas.openxmlformats.org/drawingml/2006/wordprocessingDrawing" xmlns:w10="urn:schemas-microsoft-com:office:word" xmlns:w="http://schemas.openxmlformats.org/wordprocessingml/2006/main" xmlns:w14="http://schemas.microsoft.com/office/word/2010/wordml" xmlns:w15="http://schemas.microsoft.com/office/word/2012/wordml" xmlns:w16se="http://schemas.microsoft.com/office/word/2015/wordml/symex" xmlns:wpg="http://schemas.microsoft.com/office/word/2010/wordprocessingGroup" xmlns:wpi="http://schemas.microsoft.com/office/word/2010/wordprocessingInk" xmlns:wne="http://schemas.microsoft.com/office/word/2006/wordml" xmlns:wps="http://schemas.microsoft.com/office/word/2010/wordprocessingShape" mc:Ignorable="w14 w15 w16se wp14">
+<w:endnotes xmlns:wpc="http://schemas.microsoft.com/office/word/2010/wordprocessingCanvas" xmlns:cx="http://schemas.microsoft.com/office/drawing/2014/chartex" xmlns:cx1="http://schemas.microsoft.com/office/drawing/2015/9/8/chartex" xmlns:cx2="http://schemas.microsoft.com/office/drawing/2015/10/21/chartex" xmlns:cx3="http://schemas.microsoft.com/office/drawing/2016/5/9/chartex" xmlns:cx4="http://schemas.microsoft.com/office/drawing/2016/5/10/chartex" xmlns:cx5="http://schemas.microsoft.com/office/drawing/2016/5/11/chartex" xmlns:cx6="http://schemas.microsoft.com/office/drawing/2016/5/12/chartex" xmlns:cx7="http://schemas.microsoft.com/office/drawing/2016/5/13/chartex" xmlns:cx8="http://schemas.microsoft.com/office/drawing/2016/5/14/chartex" xmlns:mc="http://schemas.openxmlformats.org/markup-compatibility/2006" xmlns:aink="http://schemas.microsoft.com/office/drawing/2016/ink" xmlns:am3d="http://schemas.microsoft.com/office/drawing/2017/model3d" xmlns:o="urn:schemas-microsoft-com:office:office" xmlns:oel="http://schemas.microsoft.com/office/2019/extlst" xmlns:r="http://schemas.openxmlformats.org/officeDocument/2006/relationships" xmlns:m="http://schemas.openxmlformats.org/officeDocument/2006/math" xmlns:v="urn:schemas-microsoft-com:vml" xmlns:wp14="http://schemas.microsoft.com/office/word/2010/wordprocessingDrawing" xmlns:wp="http://schemas.openxmlformats.org/drawingml/2006/wordprocessingDrawing" xmlns:w10="urn:schemas-microsoft-com:office:word" xmlns:w="http://schemas.openxmlformats.org/wordprocessingml/2006/main" xmlns:w14="http://schemas.microsoft.com/office/word/2010/wordml" xmlns:w15="http://schemas.microsoft.com/office/word/2012/wordml" xmlns:w16cex="http://schemas.microsoft.com/office/word/2018/wordml/cex" xmlns:w16cid="http://schemas.microsoft.com/office/word/2016/wordml/cid" xmlns:w16="http://schemas.microsoft.com/office/word/2018/wordml" xmlns:w16du="http://schemas.microsoft.com/office/word/2023/wordml/word16du" xmlns:w16sdtdh="http://schemas.microsoft.com/office/word/2020/wordml/sdtdatahash" xmlns:w16sdtfl="http://schemas.microsoft.com/office/word/2024/wordml/sdtformatlock" xmlns:w16se="http://schemas.microsoft.com/office/word/2015/wordml/symex" xmlns:wpg="http://schemas.microsoft.com/office/word/2010/wordprocessingGroup" xmlns:wpi="http://schemas.microsoft.com/office/word/2010/wordprocessingInk" xmlns:wne="http://schemas.microsoft.com/office/word/2006/wordml" xmlns:wps="http://schemas.microsoft.com/office/word/2010/wordprocessingShape" mc:Ignorable="w14 w15 w16se w16cid w16 w16cex w16sdtdh w16sdtfl w16du wp14">
   <w:endnote w:type="separator" w:id="-1">
     <w:p>
       <w:pPr>
@@ -5380,7 +7952,7 @@
 </file>
 
 <file path=word/footnotes.xml><?xml version="1.0" encoding="utf-8"?>
-<w:footnotes xmlns:wpc="http://schemas.microsoft.com/office/word/2010/wordprocessingCanvas" xmlns:cx="http://schemas.microsoft.com/office/drawing/2014/chartex" xmlns:mc="http://schemas.openxmlformats.org/markup-compatibility/2006" xmlns:o="urn:schemas-microsoft-com:office:office" xmlns:r="http://schemas.openxmlformats.org/officeDocument/2006/relationships" xmlns:m="http://schemas.openxmlformats.org/officeDocument/2006/math" xmlns:v="urn:schemas-microsoft-com:vml" xmlns:wp14="http://schemas.microsoft.com/office/word/2010/wordprocessingDrawing" xmlns:wp="http://schemas.openxmlformats.org/drawingml/2006/wordprocessingDrawing" xmlns:w10="urn:schemas-microsoft-com:office:word" xmlns:w="http://schemas.openxmlformats.org/wordprocessingml/2006/main" xmlns:w14="http://schemas.microsoft.com/office/word/2010/wordml" xmlns:w15="http://schemas.microsoft.com/office/word/2012/wordml" xmlns:w16se="http://schemas.microsoft.com/office/word/2015/wordml/symex" xmlns:wpg="http://schemas.microsoft.com/office/word/2010/wordprocessingGroup" xmlns:wpi="http://schemas.microsoft.com/office/word/2010/wordprocessingInk" xmlns:wne="http://schemas.microsoft.com/office/word/2006/wordml" xmlns:wps="http://schemas.microsoft.com/office/word/2010/wordprocessingShape" mc:Ignorable="w14 w15 w16se wp14">
+<w:footnotes xmlns:wpc="http://schemas.microsoft.com/office/word/2010/wordprocessingCanvas" xmlns:cx="http://schemas.microsoft.com/office/drawing/2014/chartex" xmlns:cx1="http://schemas.microsoft.com/office/drawing/2015/9/8/chartex" xmlns:cx2="http://schemas.microsoft.com/office/drawing/2015/10/21/chartex" xmlns:cx3="http://schemas.microsoft.com/office/drawing/2016/5/9/chartex" xmlns:cx4="http://schemas.microsoft.com/office/drawing/2016/5/10/chartex" xmlns:cx5="http://schemas.microsoft.com/office/drawing/2016/5/11/chartex" xmlns:cx6="http://schemas.microsoft.com/office/drawing/2016/5/12/chartex" xmlns:cx7="http://schemas.microsoft.com/office/drawing/2016/5/13/chartex" xmlns:cx8="http://schemas.microsoft.com/office/drawing/2016/5/14/chartex" xmlns:mc="http://schemas.openxmlformats.org/markup-compatibility/2006" xmlns:aink="http://schemas.microsoft.com/office/drawing/2016/ink" xmlns:am3d="http://schemas.microsoft.com/office/drawing/2017/model3d" xmlns:o="urn:schemas-microsoft-com:office:office" xmlns:oel="http://schemas.microsoft.com/office/2019/extlst" xmlns:r="http://schemas.openxmlformats.org/officeDocument/2006/relationships" xmlns:m="http://schemas.openxmlformats.org/officeDocument/2006/math" xmlns:v="urn:schemas-microsoft-com:vml" xmlns:wp14="http://schemas.microsoft.com/office/word/2010/wordprocessingDrawing" xmlns:wp="http://schemas.openxmlformats.org/drawingml/2006/wordprocessingDrawing" xmlns:w10="urn:schemas-microsoft-com:office:word" xmlns:w="http://schemas.openxmlformats.org/wordprocessingml/2006/main" xmlns:w14="http://schemas.microsoft.com/office/word/2010/wordml" xmlns:w15="http://schemas.microsoft.com/office/word/2012/wordml" xmlns:w16cex="http://schemas.microsoft.com/office/word/2018/wordml/cex" xmlns:w16cid="http://schemas.microsoft.com/office/word/2016/wordml/cid" xmlns:w16="http://schemas.microsoft.com/office/word/2018/wordml" xmlns:w16du="http://schemas.microsoft.com/office/word/2023/wordml/word16du" xmlns:w16sdtdh="http://schemas.microsoft.com/office/word/2020/wordml/sdtdatahash" xmlns:w16sdtfl="http://schemas.microsoft.com/office/word/2024/wordml/sdtformatlock" xmlns:w16se="http://schemas.microsoft.com/office/word/2015/wordml/symex" xmlns:wpg="http://schemas.microsoft.com/office/word/2010/wordprocessingGroup" xmlns:wpi="http://schemas.microsoft.com/office/word/2010/wordprocessingInk" xmlns:wne="http://schemas.microsoft.com/office/word/2006/wordml" xmlns:wps="http://schemas.microsoft.com/office/word/2010/wordprocessingShape" mc:Ignorable="w14 w15 w16se w16cid w16 w16cex w16sdtdh w16sdtfl w16du wp14">
   <w:footnote w:type="separator" w:id="-1">
     <w:p>
       <w:pPr>
@@ -5460,7 +8032,7 @@
 </file>
 
 <file path=word/header1.xml><?xml version="1.0" encoding="utf-8"?>
-<w:hdr xmlns:wpc="http://schemas.microsoft.com/office/word/2010/wordprocessingCanvas" xmlns:cx="http://schemas.microsoft.com/office/drawing/2014/chartex" xmlns:mc="http://schemas.openxmlformats.org/markup-compatibility/2006" xmlns:o="urn:schemas-microsoft-com:office:office" xmlns:r="http://schemas.openxmlformats.org/officeDocument/2006/relationships" xmlns:m="http://schemas.openxmlformats.org/officeDocument/2006/math" xmlns:v="urn:schemas-microsoft-com:vml" xmlns:wp14="http://schemas.microsoft.com/office/word/2010/wordprocessingDrawing" xmlns:wp="http://schemas.openxmlformats.org/drawingml/2006/wordprocessingDrawing" xmlns:w10="urn:schemas-microsoft-com:office:word" xmlns:w="http://schemas.openxmlformats.org/wordprocessingml/2006/main" xmlns:w14="http://schemas.microsoft.com/office/word/2010/wordml" xmlns:w15="http://schemas.microsoft.com/office/word/2012/wordml" xmlns:w16se="http://schemas.microsoft.com/office/word/2015/wordml/symex" xmlns:wpg="http://schemas.microsoft.com/office/word/2010/wordprocessingGroup" xmlns:wpi="http://schemas.microsoft.com/office/word/2010/wordprocessingInk" xmlns:wne="http://schemas.microsoft.com/office/word/2006/wordml" xmlns:wps="http://schemas.microsoft.com/office/word/2010/wordprocessingShape" mc:Ignorable="w14 w15 w16se wp14">
+<w:hdr xmlns:wpc="http://schemas.microsoft.com/office/word/2010/wordprocessingCanvas" xmlns:cx="http://schemas.microsoft.com/office/drawing/2014/chartex" xmlns:cx1="http://schemas.microsoft.com/office/drawing/2015/9/8/chartex" xmlns:cx2="http://schemas.microsoft.com/office/drawing/2015/10/21/chartex" xmlns:cx3="http://schemas.microsoft.com/office/drawing/2016/5/9/chartex" xmlns:cx4="http://schemas.microsoft.com/office/drawing/2016/5/10/chartex" xmlns:cx5="http://schemas.microsoft.com/office/drawing/2016/5/11/chartex" xmlns:cx6="http://schemas.microsoft.com/office/drawing/2016/5/12/chartex" xmlns:cx7="http://schemas.microsoft.com/office/drawing/2016/5/13/chartex" xmlns:cx8="http://schemas.microsoft.com/office/drawing/2016/5/14/chartex" xmlns:mc="http://schemas.openxmlformats.org/markup-compatibility/2006" xmlns:aink="http://schemas.microsoft.com/office/drawing/2016/ink" xmlns:am3d="http://schemas.microsoft.com/office/drawing/2017/model3d" xmlns:o="urn:schemas-microsoft-com:office:office" xmlns:oel="http://schemas.microsoft.com/office/2019/extlst" xmlns:r="http://schemas.openxmlformats.org/officeDocument/2006/relationships" xmlns:m="http://schemas.openxmlformats.org/officeDocument/2006/math" xmlns:v="urn:schemas-microsoft-com:vml" xmlns:wp14="http://schemas.microsoft.com/office/word/2010/wordprocessingDrawing" xmlns:wp="http://schemas.openxmlformats.org/drawingml/2006/wordprocessingDrawing" xmlns:w10="urn:schemas-microsoft-com:office:word" xmlns:w="http://schemas.openxmlformats.org/wordprocessingml/2006/main" xmlns:w14="http://schemas.microsoft.com/office/word/2010/wordml" xmlns:w15="http://schemas.microsoft.com/office/word/2012/wordml" xmlns:w16cex="http://schemas.microsoft.com/office/word/2018/wordml/cex" xmlns:w16cid="http://schemas.microsoft.com/office/word/2016/wordml/cid" xmlns:w16="http://schemas.microsoft.com/office/word/2018/wordml" xmlns:w16du="http://schemas.microsoft.com/office/word/2023/wordml/word16du" xmlns:w16sdtdh="http://schemas.microsoft.com/office/word/2020/wordml/sdtdatahash" xmlns:w16sdtfl="http://schemas.microsoft.com/office/word/2024/wordml/sdtformatlock" xmlns:w16se="http://schemas.microsoft.com/office/word/2015/wordml/symex" xmlns:wpg="http://schemas.microsoft.com/office/word/2010/wordprocessingGroup" xmlns:wpi="http://schemas.microsoft.com/office/word/2010/wordprocessingInk" xmlns:wne="http://schemas.microsoft.com/office/word/2006/wordml" xmlns:wps="http://schemas.microsoft.com/office/word/2010/wordprocessingShape" mc:Ignorable="w14 w15 w16se w16cid w16 w16cex w16sdtdh w16sdtfl w16du wp14">
   <w:tbl>
     <w:tblPr>
       <w:tblStyle w:val="Tablaconcuadrcula1"/>
@@ -5645,7 +8217,7 @@
 </file>
 
 <file path=word/numbering.xml><?xml version="1.0" encoding="utf-8"?>
-<w:numbering xmlns:wpc="http://schemas.microsoft.com/office/word/2010/wordprocessingCanvas" xmlns:cx="http://schemas.microsoft.com/office/drawing/2014/chartex" xmlns:mc="http://schemas.openxmlformats.org/markup-compatibility/2006" xmlns:o="urn:schemas-microsoft-com:office:office" xmlns:r="http://schemas.openxmlformats.org/officeDocument/2006/relationships" xmlns:m="http://schemas.openxmlformats.org/officeDocument/2006/math" xmlns:v="urn:schemas-microsoft-com:vml" xmlns:wp14="http://schemas.microsoft.com/office/word/2010/wordprocessingDrawing" xmlns:wp="http://schemas.openxmlformats.org/drawingml/2006/wordprocessingDrawing" xmlns:w10="urn:schemas-microsoft-com:office:word" xmlns:w="http://schemas.openxmlformats.org/wordprocessingml/2006/main" xmlns:w14="http://schemas.microsoft.com/office/word/2010/wordml" xmlns:w15="http://schemas.microsoft.com/office/word/2012/wordml" xmlns:w16se="http://schemas.microsoft.com/office/word/2015/wordml/symex" xmlns:wpg="http://schemas.microsoft.com/office/word/2010/wordprocessingGroup" xmlns:wpi="http://schemas.microsoft.com/office/word/2010/wordprocessingInk" xmlns:wne="http://schemas.microsoft.com/office/word/2006/wordml" xmlns:wps="http://schemas.microsoft.com/office/word/2010/wordprocessingShape" mc:Ignorable="w14 w15 w16se wp14">
+<w:numbering xmlns:wpc="http://schemas.microsoft.com/office/word/2010/wordprocessingCanvas" xmlns:cx="http://schemas.microsoft.com/office/drawing/2014/chartex" xmlns:cx1="http://schemas.microsoft.com/office/drawing/2015/9/8/chartex" xmlns:cx2="http://schemas.microsoft.com/office/drawing/2015/10/21/chartex" xmlns:cx3="http://schemas.microsoft.com/office/drawing/2016/5/9/chartex" xmlns:cx4="http://schemas.microsoft.com/office/drawing/2016/5/10/chartex" xmlns:cx5="http://schemas.microsoft.com/office/drawing/2016/5/11/chartex" xmlns:cx6="http://schemas.microsoft.com/office/drawing/2016/5/12/chartex" xmlns:cx7="http://schemas.microsoft.com/office/drawing/2016/5/13/chartex" xmlns:cx8="http://schemas.microsoft.com/office/drawing/2016/5/14/chartex" xmlns:mc="http://schemas.openxmlformats.org/markup-compatibility/2006" xmlns:aink="http://schemas.microsoft.com/office/drawing/2016/ink" xmlns:am3d="http://schemas.microsoft.com/office/drawing/2017/model3d" xmlns:o="urn:schemas-microsoft-com:office:office" xmlns:oel="http://schemas.microsoft.com/office/2019/extlst" xmlns:r="http://schemas.openxmlformats.org/officeDocument/2006/relationships" xmlns:m="http://schemas.openxmlformats.org/officeDocument/2006/math" xmlns:v="urn:schemas-microsoft-com:vml" xmlns:wp14="http://schemas.microsoft.com/office/word/2010/wordprocessingDrawing" xmlns:wp="http://schemas.openxmlformats.org/drawingml/2006/wordprocessingDrawing" xmlns:w10="urn:schemas-microsoft-com:office:word" xmlns:w="http://schemas.openxmlformats.org/wordprocessingml/2006/main" xmlns:w14="http://schemas.microsoft.com/office/word/2010/wordml" xmlns:w15="http://schemas.microsoft.com/office/word/2012/wordml" xmlns:w16cex="http://schemas.microsoft.com/office/word/2018/wordml/cex" xmlns:w16cid="http://schemas.microsoft.com/office/word/2016/wordml/cid" xmlns:w16="http://schemas.microsoft.com/office/word/2018/wordml" xmlns:w16du="http://schemas.microsoft.com/office/word/2023/wordml/word16du" xmlns:w16sdtdh="http://schemas.microsoft.com/office/word/2020/wordml/sdtdatahash" xmlns:w16sdtfl="http://schemas.microsoft.com/office/word/2024/wordml/sdtformatlock" xmlns:w16se="http://schemas.microsoft.com/office/word/2015/wordml/symex" xmlns:wpg="http://schemas.microsoft.com/office/word/2010/wordprocessingGroup" xmlns:wpi="http://schemas.microsoft.com/office/word/2010/wordprocessingInk" xmlns:wne="http://schemas.microsoft.com/office/word/2006/wordml" xmlns:wps="http://schemas.microsoft.com/office/word/2010/wordprocessingShape" mc:Ignorable="w14 w15 w16se w16cid w16 w16cex w16sdtdh w16sdtfl w16du wp14">
   <w:abstractNum w:abstractNumId="0" w15:restartNumberingAfterBreak="0">
     <w:nsid w:val="129E5F86"/>
     <w:multiLevelType w:val="hybridMultilevel"/>
@@ -6034,23 +8606,23 @@
       </w:pPr>
     </w:lvl>
   </w:abstractNum>
-  <w:num w:numId="1">
+  <w:num w:numId="1" w16cid:durableId="1677882549">
     <w:abstractNumId w:val="2"/>
   </w:num>
-  <w:num w:numId="2">
+  <w:num w:numId="2" w16cid:durableId="1688631466">
     <w:abstractNumId w:val="3"/>
   </w:num>
-  <w:num w:numId="3">
+  <w:num w:numId="3" w16cid:durableId="1813253706">
     <w:abstractNumId w:val="0"/>
   </w:num>
-  <w:num w:numId="4">
+  <w:num w:numId="4" w16cid:durableId="1505172124">
     <w:abstractNumId w:val="1"/>
   </w:num>
 </w:numbering>
 </file>
 
 <file path=word/styles.xml><?xml version="1.0" encoding="utf-8"?>
-<w:styles xmlns:mc="http://schemas.openxmlformats.org/markup-compatibility/2006" xmlns:r="http://schemas.openxmlformats.org/officeDocument/2006/relationships" xmlns:w="http://schemas.openxmlformats.org/wordprocessingml/2006/main" xmlns:w14="http://schemas.microsoft.com/office/word/2010/wordml" xmlns:w15="http://schemas.microsoft.com/office/word/2012/wordml" xmlns:w16se="http://schemas.microsoft.com/office/word/2015/wordml/symex" mc:Ignorable="w14 w15 w16se">
+<w:styles xmlns:mc="http://schemas.openxmlformats.org/markup-compatibility/2006" xmlns:r="http://schemas.openxmlformats.org/officeDocument/2006/relationships" xmlns:w="http://schemas.openxmlformats.org/wordprocessingml/2006/main" xmlns:w14="http://schemas.microsoft.com/office/word/2010/wordml" xmlns:w15="http://schemas.microsoft.com/office/word/2012/wordml" xmlns:w16cex="http://schemas.microsoft.com/office/word/2018/wordml/cex" xmlns:w16cid="http://schemas.microsoft.com/office/word/2016/wordml/cid" xmlns:w16="http://schemas.microsoft.com/office/word/2018/wordml" xmlns:w16du="http://schemas.microsoft.com/office/word/2023/wordml/word16du" xmlns:w16sdtdh="http://schemas.microsoft.com/office/word/2020/wordml/sdtdatahash" xmlns:w16sdtfl="http://schemas.microsoft.com/office/word/2024/wordml/sdtformatlock" xmlns:w16se="http://schemas.microsoft.com/office/word/2015/wordml/symex" mc:Ignorable="w14 w15 w16se w16cid w16 w16cex w16sdtdh w16sdtfl w16du">
   <w:docDefaults>
     <w:rPrDefault>
       <w:rPr>
@@ -6062,7 +8634,7 @@
     </w:rPrDefault>
     <w:pPrDefault/>
   </w:docDefaults>
-  <w:latentStyles w:defLockedState="0" w:defUIPriority="99" w:defSemiHidden="0" w:defUnhideWhenUsed="0" w:defQFormat="0" w:count="371">
+  <w:latentStyles w:defLockedState="0" w:defUIPriority="99" w:defSemiHidden="0" w:defUnhideWhenUsed="0" w:defQFormat="0" w:count="376">
     <w:lsdException w:name="Normal" w:uiPriority="0" w:qFormat="1"/>
     <w:lsdException w:name="heading 1" w:uiPriority="9" w:qFormat="1"/>
     <w:lsdException w:name="heading 2" w:semiHidden="1" w:uiPriority="9" w:unhideWhenUsed="1" w:qFormat="1"/>
@@ -6434,6 +9006,11 @@
     <w:lsdException w:name="List Table 5 Dark Accent 6" w:uiPriority="50"/>
     <w:lsdException w:name="List Table 6 Colorful Accent 6" w:uiPriority="51"/>
     <w:lsdException w:name="List Table 7 Colorful Accent 6" w:uiPriority="52"/>
+    <w:lsdException w:name="Mention" w:semiHidden="1" w:unhideWhenUsed="1"/>
+    <w:lsdException w:name="Smart Hyperlink" w:semiHidden="1" w:unhideWhenUsed="1"/>
+    <w:lsdException w:name="Hashtag" w:semiHidden="1" w:unhideWhenUsed="1"/>
+    <w:lsdException w:name="Unresolved Mention" w:semiHidden="1" w:unhideWhenUsed="1"/>
+    <w:lsdException w:name="Smart Link" w:semiHidden="1" w:unhideWhenUsed="1"/>
   </w:latentStyles>
   <w:style w:type="paragraph" w:default="1" w:styleId="Normal">
     <w:name w:val="Normal"/>
@@ -6472,7 +9049,6 @@
   <w:style w:type="character" w:default="1" w:styleId="Fuentedeprrafopredeter">
     <w:name w:val="Default Paragraph Font"/>
     <w:uiPriority w:val="1"/>
-    <w:semiHidden/>
     <w:unhideWhenUsed/>
   </w:style>
   <w:style w:type="table" w:default="1" w:styleId="Tablanormal">
@@ -7188,18 +9764,18 @@
 </file>
 
 <file path=customXml/item2.xml><?xml version="1.0" encoding="utf-8"?>
+<p:properties xmlns:p="http://schemas.microsoft.com/office/2006/metadata/properties" xmlns:xsi="http://www.w3.org/2001/XMLSchema-instance" xmlns:pc="http://schemas.microsoft.com/office/infopath/2007/PartnerControls">
+  <documentManagement/>
+</p:properties>
+</file>
+
+<file path=customXml/item3.xml><?xml version="1.0" encoding="utf-8"?>
 <?mso-contentType ?>
 <FormTemplates xmlns="http://schemas.microsoft.com/sharepoint/v3/contenttype/forms">
   <Display>DocumentLibraryForm</Display>
   <Edit>DocumentLibraryForm</Edit>
   <New>DocumentLibraryForm</New>
 </FormTemplates>
-</file>
-
-<file path=customXml/item3.xml><?xml version="1.0" encoding="utf-8"?>
-<p:properties xmlns:p="http://schemas.microsoft.com/office/2006/metadata/properties" xmlns:xsi="http://www.w3.org/2001/XMLSchema-instance" xmlns:pc="http://schemas.microsoft.com/office/infopath/2007/PartnerControls">
-  <documentManagement/>
-</p:properties>
 </file>
 
 <file path=customXml/itemProps1.xml><?xml version="1.0" encoding="utf-8"?>
@@ -7221,25 +9797,18 @@
 </file>
 
 <file path=customXml/itemProps2.xml><?xml version="1.0" encoding="utf-8"?>
+<ds:datastoreItem xmlns:ds="http://schemas.openxmlformats.org/officeDocument/2006/customXml" ds:itemID="{38174882-579A-45DC-A704-C035A9357F73}">
+  <ds:schemaRefs>
+    <ds:schemaRef ds:uri="http://schemas.microsoft.com/office/2006/metadata/properties"/>
+    <ds:schemaRef ds:uri="http://schemas.microsoft.com/office/infopath/2007/PartnerControls"/>
+  </ds:schemaRefs>
+</ds:datastoreItem>
+</file>
+
+<file path=customXml/itemProps3.xml><?xml version="1.0" encoding="utf-8"?>
 <ds:datastoreItem xmlns:ds="http://schemas.openxmlformats.org/officeDocument/2006/customXml" ds:itemID="{F3E3E2F7-59E7-4722-B872-D023DC9D1CC1}">
   <ds:schemaRefs>
     <ds:schemaRef ds:uri="http://schemas.microsoft.com/sharepoint/v3/contenttype/forms"/>
   </ds:schemaRefs>
 </ds:datastoreItem>
-</file>
-
-<file path=customXml/itemProps3.xml><?xml version="1.0" encoding="utf-8"?>
-<ds:datastoreItem xmlns:ds="http://schemas.openxmlformats.org/officeDocument/2006/customXml" ds:itemID="{38174882-579A-45DC-A704-C035A9357F73}">
-  <ds:schemaRefs>
-    <ds:schemaRef ds:uri="http://purl.org/dc/elements/1.1/"/>
-    <ds:schemaRef ds:uri="126e8a1c-9ea9-435a-ac89-d06c80d62e30"/>
-    <ds:schemaRef ds:uri="http://purl.org/dc/dcmitype/"/>
-    <ds:schemaRef ds:uri="http://schemas.microsoft.com/office/2006/documentManagement/types"/>
-    <ds:schemaRef ds:uri="http://www.w3.org/XML/1998/namespace"/>
-    <ds:schemaRef ds:uri="http://schemas.microsoft.com/office/2006/metadata/properties"/>
-    <ds:schemaRef ds:uri="http://schemas.microsoft.com/office/infopath/2007/PartnerControls"/>
-    <ds:schemaRef ds:uri="http://schemas.openxmlformats.org/package/2006/metadata/core-properties"/>
-    <ds:schemaRef ds:uri="http://purl.org/dc/terms/"/>
-  </ds:schemaRefs>
-</ds:datastoreItem>
 </file>
</xml_diff>

<commit_message>
Corrige referencia al proyecto real en 1.5 y 2.4
</commit_message>
<xml_diff>
--- a/Fase 1/Evidencias grupales/Ramirez_Karla_1.5_GuiaEstudiante_Fase 1_Definicion Proyecto APT (Español).docx
+++ b/Fase 1/Evidencias grupales/Ramirez_Karla_1.5_GuiaEstudiante_Fase 1_Definicion Proyecto APT (Español).docx
@@ -2386,7 +2386,7 @@
             </w:r>
             <w:proofErr w:type="gramEnd"/>
             <w:r>
-              <w:t xml:space="preserve"> más el tiempo de trabajo autónomo distribuido durante la semana, y que el proyecto se desarrolla en solitario (autorizado por el docente), lo que evita tiempos de coordinación de equipo. Como materiales solo se requiere equipo propio (notebook) y herramientas gratuitas (Git/GitHub, PostgreSQL, IDE). Entre los factores externos que facilitan el desarrollo está mi experiencia previa en un sistema similar en mi trabajo actual, que me sirve como referencia de patrones de diseño ya validados. Como factor que podría dificultarlo, al trabajar en solitario, cualquier imprevisto (ej. carga laboral alta en mi trabajo) afecta directamente el avance sin poder redistribuir tareas a un equipo — se mitiga acotando el alcance a un MVP realista y priorizando los procesos críticos de RRHH por sobre funcionalidades secundarias.</w:t>
+              <w:t xml:space="preserve"> más el tiempo de trabajo autónomo distribuido durante la semana, y que el proyecto se desarrolla en solitario (autorizado por el docente), lo que evita tiempos de coordinación de equipo. Como materiales solo se requiere equipo propio (notebook) y herramientas gratuitas (Git/GitHub, PostgreSQL, IDE). Entre los factores externos que facilitan el desarrollo está mi experiencia en el proyecto real, que me sirve como referencia de patrones de diseño ya validados. Como factor que podría dificultarlo, al trabajar en solitario, cualquier imprevisto (ej. carga laboral alta en mi trabajo) afecta directamente el avance sin poder redistribuir tareas a un equipo — se mitiga acotando el alcance a un MVP realista y priorizando los procesos críticos de RRHH por sobre funcionalidades secundarias.</w:t>
             </w:r>
           </w:p>
         </w:tc>
@@ -4203,7 +4203,7 @@
               </w:rPr>
             </w:pPr>
             <w:r>
-              <w:t xml:space="preserve">Facilitador: experiencia previa en un sistema similar. </w:t>
+              <w:t xml:space="preserve">Facilitador: experiencia en el proyecto real. </w:t>
             </w:r>
             <w:r>
               <w:lastRenderedPageBreak/>

</xml_diff>

<commit_message>
Actualiza 2.4, responde 2.6, ajusta intereses en 1.5 y agrega bitacora de desarrollo
</commit_message>
<xml_diff>
--- a/Fase 1/Evidencias grupales/Ramirez_Karla_1.5_GuiaEstudiante_Fase 1_Definicion Proyecto APT (Español).docx
+++ b/Fase 1/Evidencias grupales/Ramirez_Karla_1.5_GuiaEstudiante_Fase 1_Definicion Proyecto APT (Español).docx
@@ -2298,23 +2298,14 @@
               </w:rPr>
             </w:pPr>
             <w:r>
-              <w:t>Mis intereses profesionales combinan el desarrollo técnico con el análisis y diseño de soluciones y la gestión de proyectos — me proyecto liderando equipos de desarrollo, no solo ejecutando</w:t>
-            </w:r>
-            <w:r>
-              <w:t xml:space="preserve">. </w:t>
-            </w:r>
+              <w:t>Mis intereses profesionales combinan el desarrollo técnico con el análisis y diseño de soluciones y la gestión de proyectos. Aún no tengo definido si me proyecto como líder técnico o como Product Owner, pero sé que busco un rol de liderazgo y de toma de decisiones, y no solo escribir código. Promaty me exige justamente eso: analizar el proceso de negocio de RRHH de principio a fin, definir el alcance del MVP, priorizar qué construir primero y defender cada decisión de diseño sin depender de un equipo. Desarrollar este proyecto contribuye a mi desarrollo profesional porque practico la toma de decisiones de arquitectura y de alcance, y su comunicación con claridad.</w:t>
+            </w:r>
+            <w:r/>
             <w:proofErr w:type="spellStart"/>
-            <w:r>
-              <w:t>Promaty</w:t>
-            </w:r>
+            <w:r/>
             <w:proofErr w:type="spellEnd"/>
-            <w:r>
-              <w:t xml:space="preserve"> me exige justamente eso: </w:t>
-            </w:r>
-            <w:r>
-              <w:lastRenderedPageBreak/>
-              <w:t>analizar el proceso de negocio de RRHH de principio a fin, definir el alcance del MVP, priorizar qué construir primero, y defender cada decisión de diseño sin depender de un equipo. Desarrollar este proyecto contribuye a mi desarrollo profesional porque practico de forma concreta el rol de liderazgo técnico al que apunto: tomar decisiones de arquitectura y alcance, y comunicarlas con claridad.</w:t>
-            </w:r>
+            <w:r/>
+            <w:r/>
           </w:p>
         </w:tc>
       </w:tr>

</xml_diff>